<commit_message>
Update vendor scorecard with site backlinks and branding
</commit_message>
<xml_diff>
--- a/public/assets/hr-software-vendor-scorecard.docx
+++ b/public/assets/hr-software-vendor-scorecard.docx
@@ -4,14 +4,15 @@
   <w:body>
     <w:p>
       <w:pPr>
-        <w:pStyle w:val="Title"/>
         <w:jc w:val="center"/>
       </w:pPr>
       <w:r>
-        <w:t>HR Software</w:t>
-      </w:r>
-      <w:r>
-        <w:t xml:space="preserve"> Vendor Evaluation Scorecard</w:t>
+        <w:rPr>
+          <w:b/>
+          <w:color w:val="4F46E5"/>
+          <w:sz w:val="32"/>
+        </w:rPr>
+        <w:t>HR Software Vendor Evaluation Scorecard</w:t>
       </w:r>
     </w:p>
     <w:p>
@@ -20,132 +21,50 @@
       </w:pPr>
       <w:r>
         <w:rPr>
-          <w:b/>
-          <w:color w:val="646464"/>
+          <w:sz w:val="24"/>
         </w:rPr>
         <w:t>Master Demo Template</w:t>
       </w:r>
     </w:p>
     <w:p>
+      <w:pPr>
+        <w:pStyle w:val="Heading2"/>
+      </w:pPr>
       <w:r>
-        <w:br/>
+        <w:t>How to use this template:</w:t>
       </w:r>
     </w:p>
     <w:p>
       <w:r>
-        <w:rPr>
-          <w:b/>
-        </w:rPr>
-        <w:t>How to use this template:</w:t>
-      </w:r>
-      <w:r>
-        <w:rPr>
-          <w:b/>
-        </w:rPr>
-        <w:br/>
-      </w:r>
-      <w:r>
         <w:t>1. Create one copy of this document for each vendor you are evaluating.</w:t>
       </w:r>
+    </w:p>
+    <w:p>
       <w:r>
-        <w:br/>
         <w:t>2. Fill out the sections below during or immediately after your sales demo.</w:t>
       </w:r>
+    </w:p>
+    <w:p>
       <w:r>
-        <w:br/>
-        <w:t xml:space="preserve">3. Score each requirement from </w:t>
+        <w:t>3. Score each requirement from 1 (Poor/Lacking) to 5 (Excellent/Native).</w:t>
       </w:r>
+    </w:p>
+    <w:p>
       <w:r>
-        <w:rPr>
-          <w:b/>
-        </w:rPr>
-        <w:t>1 (Poor/Lacking) to 5 (Excellent/Native)</w:t>
-      </w:r>
-      <w:r>
-        <w:t>.</w:t>
-      </w:r>
-      <w:r>
-        <w:br/>
         <w:t>4. Once all vendor demos are complete, use the final Summary page to compare total scores.</w:t>
       </w:r>
     </w:p>
     <w:p>
       <w:r>
-        <w:br/>
+        <w:t>Vendor Name: _______________________ | Date of Demo: _______________________</w:t>
       </w:r>
     </w:p>
-    <w:tbl>
-      <w:tblPr>
-        <w:tblW w:w="0" w:type="auto"/>
-        <w:tblLayout w:type="fixed"/>
-        <w:tblLook w:val="04A0" w:firstRow="1" w:lastRow="0" w:firstColumn="1" w:lastColumn="0" w:noHBand="0" w:noVBand="1"/>
-      </w:tblPr>
-      <w:tblGrid>
-        <w:gridCol w:w="4320"/>
-        <w:gridCol w:w="4320"/>
-      </w:tblGrid>
-      <w:tr>
-        <w:tc>
-          <w:tcPr>
-            <w:tcW w:w="4320" w:type="dxa"/>
-          </w:tcPr>
-          <w:p>
-            <w:r>
-              <w:rPr>
-                <w:b/>
-              </w:rPr>
-              <w:t>Vendor Name: _______________________</w:t>
-            </w:r>
-          </w:p>
-        </w:tc>
-        <w:tc>
-          <w:tcPr>
-            <w:tcW w:w="4320" w:type="dxa"/>
-          </w:tcPr>
-          <w:p>
-            <w:r>
-              <w:rPr>
-                <w:b/>
-              </w:rPr>
-              <w:t>Date of Demo: _______________________</w:t>
-            </w:r>
-          </w:p>
-        </w:tc>
-      </w:tr>
-      <w:tr>
-        <w:tc>
-          <w:tcPr>
-            <w:tcW w:w="4320" w:type="dxa"/>
-          </w:tcPr>
-          <w:p>
-            <w:r>
-              <w:rPr>
-                <w:b/>
-              </w:rPr>
-              <w:t>Sales Rep / Contact: ________________</w:t>
-            </w:r>
-          </w:p>
-        </w:tc>
-        <w:tc>
-          <w:tcPr>
-            <w:tcW w:w="4320" w:type="dxa"/>
-          </w:tcPr>
-          <w:p>
-            <w:r>
-              <w:rPr>
-                <w:b/>
-              </w:rPr>
-              <w:t>Evaluator Name: _____________________</w:t>
-            </w:r>
-          </w:p>
-        </w:tc>
-      </w:tr>
-    </w:tbl>
     <w:p>
       <w:r>
-        <w:br/>
+        <w:t>Sales Rep / Contact: ________________ | Evaluator Name: _____________________</w:t>
       </w:r>
     </w:p>
+    <w:p/>
     <w:p>
       <w:pPr>
         <w:pStyle w:val="Heading2"/>
@@ -156,23 +75,18 @@
     </w:p>
     <w:tbl>
       <w:tblPr>
-        <w:tblStyle w:val="LightGrid-Accent1"/>
-        <w:tblW w:w="10031" w:type="dxa"/>
-        <w:tblLayout w:type="fixed"/>
+        <w:tblStyle w:val="TableGrid"/>
+        <w:tblW w:w="0" w:type="auto"/>
         <w:tblLook w:val="04A0" w:firstRow="1" w:lastRow="0" w:firstColumn="1" w:lastColumn="0" w:noHBand="0" w:noVBand="1"/>
       </w:tblPr>
       <w:tblGrid>
-        <w:gridCol w:w="5040"/>
-        <w:gridCol w:w="1022"/>
-        <w:gridCol w:w="3969"/>
+        <w:gridCol w:w="4195"/>
+        <w:gridCol w:w="2328"/>
+        <w:gridCol w:w="2333"/>
       </w:tblGrid>
       <w:tr>
-        <w:trPr>
-          <w:cnfStyle w:val="100000000000" w:firstRow="1" w:lastRow="0" w:firstColumn="0" w:lastColumn="0" w:oddVBand="0" w:evenVBand="0" w:oddHBand="0" w:evenHBand="0" w:firstRowFirstColumn="0" w:firstRowLastColumn="0" w:lastRowFirstColumn="0" w:lastRowLastColumn="0"/>
-        </w:trPr>
         <w:tc>
           <w:tcPr>
-            <w:cnfStyle w:val="001000000000" w:firstRow="0" w:lastRow="0" w:firstColumn="1" w:lastColumn="0" w:oddVBand="0" w:evenVBand="0" w:oddHBand="0" w:evenHBand="0" w:firstRowFirstColumn="0" w:firstRowLastColumn="0" w:lastRowFirstColumn="0" w:lastRowLastColumn="0"/>
             <w:tcW w:w="5040" w:type="dxa"/>
           </w:tcPr>
           <w:p>
@@ -183,12 +97,9 @@
         </w:tc>
         <w:tc>
           <w:tcPr>
-            <w:tcW w:w="1022" w:type="dxa"/>
+            <w:tcW w:w="1440" w:type="dxa"/>
           </w:tcPr>
           <w:p>
-            <w:pPr>
-              <w:cnfStyle w:val="100000000000" w:firstRow="1" w:lastRow="0" w:firstColumn="0" w:lastColumn="0" w:oddVBand="0" w:evenVBand="0" w:oddHBand="0" w:evenHBand="0" w:firstRowFirstColumn="0" w:firstRowLastColumn="0" w:lastRowFirstColumn="0" w:lastRowLastColumn="0"/>
-            </w:pPr>
             <w:r>
               <w:t>Score (1-5)</w:t>
             </w:r>
@@ -196,12 +107,9 @@
         </w:tc>
         <w:tc>
           <w:tcPr>
-            <w:tcW w:w="3969" w:type="dxa"/>
+            <w:tcW w:w="2880" w:type="dxa"/>
           </w:tcPr>
           <w:p>
-            <w:pPr>
-              <w:cnfStyle w:val="100000000000" w:firstRow="1" w:lastRow="0" w:firstColumn="0" w:lastColumn="0" w:oddVBand="0" w:evenVBand="0" w:oddHBand="0" w:evenHBand="0" w:firstRowFirstColumn="0" w:firstRowLastColumn="0" w:lastRowFirstColumn="0" w:lastRowLastColumn="0"/>
-            </w:pPr>
             <w:r>
               <w:t>Notes / Red Flags</w:t>
             </w:r>
@@ -209,13 +117,9 @@
         </w:tc>
       </w:tr>
       <w:tr>
-        <w:trPr>
-          <w:cnfStyle w:val="000000100000" w:firstRow="0" w:lastRow="0" w:firstColumn="0" w:lastColumn="0" w:oddVBand="0" w:evenVBand="0" w:oddHBand="1" w:evenHBand="0" w:firstRowFirstColumn="0" w:firstRowLastColumn="0" w:lastRowFirstColumn="0" w:lastRowLastColumn="0"/>
-        </w:trPr>
         <w:tc>
           <w:tcPr>
-            <w:cnfStyle w:val="001000000000" w:firstRow="0" w:lastRow="0" w:firstColumn="1" w:lastColumn="0" w:oddVBand="0" w:evenVBand="0" w:oddHBand="0" w:evenHBand="0" w:firstRowFirstColumn="0" w:firstRowLastColumn="0" w:lastRowFirstColumn="0" w:lastRowLastColumn="0"/>
-            <w:tcW w:w="5040" w:type="dxa"/>
+            <w:tcW w:w="2880" w:type="dxa"/>
           </w:tcPr>
           <w:p>
             <w:r>
@@ -225,12 +129,9 @@
         </w:tc>
         <w:tc>
           <w:tcPr>
-            <w:tcW w:w="1022" w:type="dxa"/>
+            <w:tcW w:w="2880" w:type="dxa"/>
           </w:tcPr>
           <w:p>
-            <w:pPr>
-              <w:cnfStyle w:val="000000100000" w:firstRow="0" w:lastRow="0" w:firstColumn="0" w:lastColumn="0" w:oddVBand="0" w:evenVBand="0" w:oddHBand="1" w:evenHBand="0" w:firstRowFirstColumn="0" w:firstRowLastColumn="0" w:lastRowFirstColumn="0" w:lastRowLastColumn="0"/>
-            </w:pPr>
             <w:r>
               <w:t>___ / 5</w:t>
             </w:r>
@@ -238,23 +139,15 @@
         </w:tc>
         <w:tc>
           <w:tcPr>
-            <w:tcW w:w="3969" w:type="dxa"/>
+            <w:tcW w:w="2880" w:type="dxa"/>
           </w:tcPr>
-          <w:p>
-            <w:pPr>
-              <w:cnfStyle w:val="000000100000" w:firstRow="0" w:lastRow="0" w:firstColumn="0" w:lastColumn="0" w:oddVBand="0" w:evenVBand="0" w:oddHBand="1" w:evenHBand="0" w:firstRowFirstColumn="0" w:firstRowLastColumn="0" w:lastRowFirstColumn="0" w:lastRowLastColumn="0"/>
-            </w:pPr>
-          </w:p>
+          <w:p/>
         </w:tc>
       </w:tr>
       <w:tr>
-        <w:trPr>
-          <w:cnfStyle w:val="000000010000" w:firstRow="0" w:lastRow="0" w:firstColumn="0" w:lastColumn="0" w:oddVBand="0" w:evenVBand="0" w:oddHBand="0" w:evenHBand="1" w:firstRowFirstColumn="0" w:firstRowLastColumn="0" w:lastRowFirstColumn="0" w:lastRowLastColumn="0"/>
-        </w:trPr>
         <w:tc>
           <w:tcPr>
-            <w:cnfStyle w:val="001000000000" w:firstRow="0" w:lastRow="0" w:firstColumn="1" w:lastColumn="0" w:oddVBand="0" w:evenVBand="0" w:oddHBand="0" w:evenHBand="0" w:firstRowFirstColumn="0" w:firstRowLastColumn="0" w:lastRowFirstColumn="0" w:lastRowLastColumn="0"/>
-            <w:tcW w:w="5040" w:type="dxa"/>
+            <w:tcW w:w="2880" w:type="dxa"/>
           </w:tcPr>
           <w:p>
             <w:r>
@@ -264,12 +157,9 @@
         </w:tc>
         <w:tc>
           <w:tcPr>
-            <w:tcW w:w="1022" w:type="dxa"/>
+            <w:tcW w:w="2880" w:type="dxa"/>
           </w:tcPr>
           <w:p>
-            <w:pPr>
-              <w:cnfStyle w:val="000000010000" w:firstRow="0" w:lastRow="0" w:firstColumn="0" w:lastColumn="0" w:oddVBand="0" w:evenVBand="0" w:oddHBand="0" w:evenHBand="1" w:firstRowFirstColumn="0" w:firstRowLastColumn="0" w:lastRowFirstColumn="0" w:lastRowLastColumn="0"/>
-            </w:pPr>
             <w:r>
               <w:t>___ / 5</w:t>
             </w:r>
@@ -277,23 +167,15 @@
         </w:tc>
         <w:tc>
           <w:tcPr>
-            <w:tcW w:w="3969" w:type="dxa"/>
+            <w:tcW w:w="2880" w:type="dxa"/>
           </w:tcPr>
-          <w:p>
-            <w:pPr>
-              <w:cnfStyle w:val="000000010000" w:firstRow="0" w:lastRow="0" w:firstColumn="0" w:lastColumn="0" w:oddVBand="0" w:evenVBand="0" w:oddHBand="0" w:evenHBand="1" w:firstRowFirstColumn="0" w:firstRowLastColumn="0" w:lastRowFirstColumn="0" w:lastRowLastColumn="0"/>
-            </w:pPr>
-          </w:p>
+          <w:p/>
         </w:tc>
       </w:tr>
       <w:tr>
-        <w:trPr>
-          <w:cnfStyle w:val="000000100000" w:firstRow="0" w:lastRow="0" w:firstColumn="0" w:lastColumn="0" w:oddVBand="0" w:evenVBand="0" w:oddHBand="1" w:evenHBand="0" w:firstRowFirstColumn="0" w:firstRowLastColumn="0" w:lastRowFirstColumn="0" w:lastRowLastColumn="0"/>
-        </w:trPr>
         <w:tc>
           <w:tcPr>
-            <w:cnfStyle w:val="001000000000" w:firstRow="0" w:lastRow="0" w:firstColumn="1" w:lastColumn="0" w:oddVBand="0" w:evenVBand="0" w:oddHBand="0" w:evenHBand="0" w:firstRowFirstColumn="0" w:firstRowLastColumn="0" w:lastRowFirstColumn="0" w:lastRowLastColumn="0"/>
-            <w:tcW w:w="5040" w:type="dxa"/>
+            <w:tcW w:w="2880" w:type="dxa"/>
           </w:tcPr>
           <w:p>
             <w:r>
@@ -303,12 +185,9 @@
         </w:tc>
         <w:tc>
           <w:tcPr>
-            <w:tcW w:w="1022" w:type="dxa"/>
+            <w:tcW w:w="2880" w:type="dxa"/>
           </w:tcPr>
           <w:p>
-            <w:pPr>
-              <w:cnfStyle w:val="000000100000" w:firstRow="0" w:lastRow="0" w:firstColumn="0" w:lastColumn="0" w:oddVBand="0" w:evenVBand="0" w:oddHBand="1" w:evenHBand="0" w:firstRowFirstColumn="0" w:firstRowLastColumn="0" w:lastRowFirstColumn="0" w:lastRowLastColumn="0"/>
-            </w:pPr>
             <w:r>
               <w:t>___ / 5</w:t>
             </w:r>
@@ -316,23 +195,15 @@
         </w:tc>
         <w:tc>
           <w:tcPr>
-            <w:tcW w:w="3969" w:type="dxa"/>
+            <w:tcW w:w="2880" w:type="dxa"/>
           </w:tcPr>
-          <w:p>
-            <w:pPr>
-              <w:cnfStyle w:val="000000100000" w:firstRow="0" w:lastRow="0" w:firstColumn="0" w:lastColumn="0" w:oddVBand="0" w:evenVBand="0" w:oddHBand="1" w:evenHBand="0" w:firstRowFirstColumn="0" w:firstRowLastColumn="0" w:lastRowFirstColumn="0" w:lastRowLastColumn="0"/>
-            </w:pPr>
-          </w:p>
+          <w:p/>
         </w:tc>
       </w:tr>
       <w:tr>
-        <w:trPr>
-          <w:cnfStyle w:val="000000010000" w:firstRow="0" w:lastRow="0" w:firstColumn="0" w:lastColumn="0" w:oddVBand="0" w:evenVBand="0" w:oddHBand="0" w:evenHBand="1" w:firstRowFirstColumn="0" w:firstRowLastColumn="0" w:lastRowFirstColumn="0" w:lastRowLastColumn="0"/>
-        </w:trPr>
         <w:tc>
           <w:tcPr>
-            <w:cnfStyle w:val="001000000000" w:firstRow="0" w:lastRow="0" w:firstColumn="1" w:lastColumn="0" w:oddVBand="0" w:evenVBand="0" w:oddHBand="0" w:evenHBand="0" w:firstRowFirstColumn="0" w:firstRowLastColumn="0" w:lastRowFirstColumn="0" w:lastRowLastColumn="0"/>
-            <w:tcW w:w="5040" w:type="dxa"/>
+            <w:tcW w:w="2880" w:type="dxa"/>
           </w:tcPr>
           <w:p>
             <w:r>
@@ -342,12 +213,9 @@
         </w:tc>
         <w:tc>
           <w:tcPr>
-            <w:tcW w:w="1022" w:type="dxa"/>
+            <w:tcW w:w="2880" w:type="dxa"/>
           </w:tcPr>
           <w:p>
-            <w:pPr>
-              <w:cnfStyle w:val="000000010000" w:firstRow="0" w:lastRow="0" w:firstColumn="0" w:lastColumn="0" w:oddVBand="0" w:evenVBand="0" w:oddHBand="0" w:evenHBand="1" w:firstRowFirstColumn="0" w:firstRowLastColumn="0" w:lastRowFirstColumn="0" w:lastRowLastColumn="0"/>
-            </w:pPr>
             <w:r>
               <w:t>___ / 5</w:t>
             </w:r>
@@ -355,23 +223,15 @@
         </w:tc>
         <w:tc>
           <w:tcPr>
-            <w:tcW w:w="3969" w:type="dxa"/>
+            <w:tcW w:w="2880" w:type="dxa"/>
           </w:tcPr>
-          <w:p>
-            <w:pPr>
-              <w:cnfStyle w:val="000000010000" w:firstRow="0" w:lastRow="0" w:firstColumn="0" w:lastColumn="0" w:oddVBand="0" w:evenVBand="0" w:oddHBand="0" w:evenHBand="1" w:firstRowFirstColumn="0" w:firstRowLastColumn="0" w:lastRowFirstColumn="0" w:lastRowLastColumn="0"/>
-            </w:pPr>
-          </w:p>
+          <w:p/>
         </w:tc>
       </w:tr>
       <w:tr>
-        <w:trPr>
-          <w:cnfStyle w:val="000000100000" w:firstRow="0" w:lastRow="0" w:firstColumn="0" w:lastColumn="0" w:oddVBand="0" w:evenVBand="0" w:oddHBand="1" w:evenHBand="0" w:firstRowFirstColumn="0" w:firstRowLastColumn="0" w:lastRowFirstColumn="0" w:lastRowLastColumn="0"/>
-        </w:trPr>
         <w:tc>
           <w:tcPr>
-            <w:cnfStyle w:val="001000000000" w:firstRow="0" w:lastRow="0" w:firstColumn="1" w:lastColumn="0" w:oddVBand="0" w:evenVBand="0" w:oddHBand="0" w:evenHBand="0" w:firstRowFirstColumn="0" w:firstRowLastColumn="0" w:lastRowFirstColumn="0" w:lastRowLastColumn="0"/>
-            <w:tcW w:w="5040" w:type="dxa"/>
+            <w:tcW w:w="2880" w:type="dxa"/>
           </w:tcPr>
           <w:p>
             <w:r>
@@ -381,12 +241,9 @@
         </w:tc>
         <w:tc>
           <w:tcPr>
-            <w:tcW w:w="1022" w:type="dxa"/>
+            <w:tcW w:w="2880" w:type="dxa"/>
           </w:tcPr>
           <w:p>
-            <w:pPr>
-              <w:cnfStyle w:val="000000100000" w:firstRow="0" w:lastRow="0" w:firstColumn="0" w:lastColumn="0" w:oddVBand="0" w:evenVBand="0" w:oddHBand="1" w:evenHBand="0" w:firstRowFirstColumn="0" w:firstRowLastColumn="0" w:lastRowFirstColumn="0" w:lastRowLastColumn="0"/>
-            </w:pPr>
             <w:r>
               <w:t>___ / 5</w:t>
             </w:r>
@@ -394,49 +251,35 @@
         </w:tc>
         <w:tc>
           <w:tcPr>
-            <w:tcW w:w="3969" w:type="dxa"/>
+            <w:tcW w:w="2880" w:type="dxa"/>
           </w:tcPr>
-          <w:p>
-            <w:pPr>
-              <w:cnfStyle w:val="000000100000" w:firstRow="0" w:lastRow="0" w:firstColumn="0" w:lastColumn="0" w:oddVBand="0" w:evenVBand="0" w:oddHBand="1" w:evenHBand="0" w:firstRowFirstColumn="0" w:firstRowLastColumn="0" w:lastRowFirstColumn="0" w:lastRowLastColumn="0"/>
-            </w:pPr>
-          </w:p>
+          <w:p/>
         </w:tc>
       </w:tr>
     </w:tbl>
-    <w:p>
-      <w:r>
-        <w:br/>
-      </w:r>
-    </w:p>
+    <w:p/>
     <w:p>
       <w:pPr>
         <w:pStyle w:val="Heading2"/>
       </w:pPr>
       <w:r>
-        <w:lastRenderedPageBreak/>
         <w:t>2. Product &amp; Capabilities</w:t>
       </w:r>
     </w:p>
     <w:tbl>
       <w:tblPr>
-        <w:tblStyle w:val="LightGrid-Accent1"/>
-        <w:tblW w:w="10031" w:type="dxa"/>
-        <w:tblLayout w:type="fixed"/>
+        <w:tblStyle w:val="TableGrid"/>
+        <w:tblW w:w="0" w:type="auto"/>
         <w:tblLook w:val="04A0" w:firstRow="1" w:lastRow="0" w:firstColumn="1" w:lastColumn="0" w:noHBand="0" w:noVBand="1"/>
       </w:tblPr>
       <w:tblGrid>
-        <w:gridCol w:w="5040"/>
-        <w:gridCol w:w="1022"/>
-        <w:gridCol w:w="3969"/>
+        <w:gridCol w:w="4183"/>
+        <w:gridCol w:w="2334"/>
+        <w:gridCol w:w="2339"/>
       </w:tblGrid>
       <w:tr>
-        <w:trPr>
-          <w:cnfStyle w:val="100000000000" w:firstRow="1" w:lastRow="0" w:firstColumn="0" w:lastColumn="0" w:oddVBand="0" w:evenVBand="0" w:oddHBand="0" w:evenHBand="0" w:firstRowFirstColumn="0" w:firstRowLastColumn="0" w:lastRowFirstColumn="0" w:lastRowLastColumn="0"/>
-        </w:trPr>
         <w:tc>
           <w:tcPr>
-            <w:cnfStyle w:val="001000000000" w:firstRow="0" w:lastRow="0" w:firstColumn="1" w:lastColumn="0" w:oddVBand="0" w:evenVBand="0" w:oddHBand="0" w:evenHBand="0" w:firstRowFirstColumn="0" w:firstRowLastColumn="0" w:lastRowFirstColumn="0" w:lastRowLastColumn="0"/>
             <w:tcW w:w="5040" w:type="dxa"/>
           </w:tcPr>
           <w:p>
@@ -447,12 +290,9 @@
         </w:tc>
         <w:tc>
           <w:tcPr>
-            <w:tcW w:w="1022" w:type="dxa"/>
+            <w:tcW w:w="1440" w:type="dxa"/>
           </w:tcPr>
           <w:p>
-            <w:pPr>
-              <w:cnfStyle w:val="100000000000" w:firstRow="1" w:lastRow="0" w:firstColumn="0" w:lastColumn="0" w:oddVBand="0" w:evenVBand="0" w:oddHBand="0" w:evenHBand="0" w:firstRowFirstColumn="0" w:firstRowLastColumn="0" w:lastRowFirstColumn="0" w:lastRowLastColumn="0"/>
-            </w:pPr>
             <w:r>
               <w:t>Score (1-5)</w:t>
             </w:r>
@@ -460,12 +300,9 @@
         </w:tc>
         <w:tc>
           <w:tcPr>
-            <w:tcW w:w="3969" w:type="dxa"/>
+            <w:tcW w:w="2880" w:type="dxa"/>
           </w:tcPr>
           <w:p>
-            <w:pPr>
-              <w:cnfStyle w:val="100000000000" w:firstRow="1" w:lastRow="0" w:firstColumn="0" w:lastColumn="0" w:oddVBand="0" w:evenVBand="0" w:oddHBand="0" w:evenHBand="0" w:firstRowFirstColumn="0" w:firstRowLastColumn="0" w:lastRowFirstColumn="0" w:lastRowLastColumn="0"/>
-            </w:pPr>
             <w:r>
               <w:t>Notes / Red Flags</w:t>
             </w:r>
@@ -473,13 +310,9 @@
         </w:tc>
       </w:tr>
       <w:tr>
-        <w:trPr>
-          <w:cnfStyle w:val="000000100000" w:firstRow="0" w:lastRow="0" w:firstColumn="0" w:lastColumn="0" w:oddVBand="0" w:evenVBand="0" w:oddHBand="1" w:evenHBand="0" w:firstRowFirstColumn="0" w:firstRowLastColumn="0" w:lastRowFirstColumn="0" w:lastRowLastColumn="0"/>
-        </w:trPr>
         <w:tc>
           <w:tcPr>
-            <w:cnfStyle w:val="001000000000" w:firstRow="0" w:lastRow="0" w:firstColumn="1" w:lastColumn="0" w:oddVBand="0" w:evenVBand="0" w:oddHBand="0" w:evenHBand="0" w:firstRowFirstColumn="0" w:firstRowLastColumn="0" w:lastRowFirstColumn="0" w:lastRowLastColumn="0"/>
-            <w:tcW w:w="5040" w:type="dxa"/>
+            <w:tcW w:w="2880" w:type="dxa"/>
           </w:tcPr>
           <w:p>
             <w:r>
@@ -489,12 +322,9 @@
         </w:tc>
         <w:tc>
           <w:tcPr>
-            <w:tcW w:w="1022" w:type="dxa"/>
+            <w:tcW w:w="2880" w:type="dxa"/>
           </w:tcPr>
           <w:p>
-            <w:pPr>
-              <w:cnfStyle w:val="000000100000" w:firstRow="0" w:lastRow="0" w:firstColumn="0" w:lastColumn="0" w:oddVBand="0" w:evenVBand="0" w:oddHBand="1" w:evenHBand="0" w:firstRowFirstColumn="0" w:firstRowLastColumn="0" w:lastRowFirstColumn="0" w:lastRowLastColumn="0"/>
-            </w:pPr>
             <w:r>
               <w:t>___ / 5</w:t>
             </w:r>
@@ -502,23 +332,15 @@
         </w:tc>
         <w:tc>
           <w:tcPr>
-            <w:tcW w:w="3969" w:type="dxa"/>
+            <w:tcW w:w="2880" w:type="dxa"/>
           </w:tcPr>
-          <w:p>
-            <w:pPr>
-              <w:cnfStyle w:val="000000100000" w:firstRow="0" w:lastRow="0" w:firstColumn="0" w:lastColumn="0" w:oddVBand="0" w:evenVBand="0" w:oddHBand="1" w:evenHBand="0" w:firstRowFirstColumn="0" w:firstRowLastColumn="0" w:lastRowFirstColumn="0" w:lastRowLastColumn="0"/>
-            </w:pPr>
-          </w:p>
+          <w:p/>
         </w:tc>
       </w:tr>
       <w:tr>
-        <w:trPr>
-          <w:cnfStyle w:val="000000010000" w:firstRow="0" w:lastRow="0" w:firstColumn="0" w:lastColumn="0" w:oddVBand="0" w:evenVBand="0" w:oddHBand="0" w:evenHBand="1" w:firstRowFirstColumn="0" w:firstRowLastColumn="0" w:lastRowFirstColumn="0" w:lastRowLastColumn="0"/>
-        </w:trPr>
         <w:tc>
           <w:tcPr>
-            <w:cnfStyle w:val="001000000000" w:firstRow="0" w:lastRow="0" w:firstColumn="1" w:lastColumn="0" w:oddVBand="0" w:evenVBand="0" w:oddHBand="0" w:evenHBand="0" w:firstRowFirstColumn="0" w:firstRowLastColumn="0" w:lastRowFirstColumn="0" w:lastRowLastColumn="0"/>
-            <w:tcW w:w="5040" w:type="dxa"/>
+            <w:tcW w:w="2880" w:type="dxa"/>
           </w:tcPr>
           <w:p>
             <w:r>
@@ -528,12 +350,9 @@
         </w:tc>
         <w:tc>
           <w:tcPr>
-            <w:tcW w:w="1022" w:type="dxa"/>
+            <w:tcW w:w="2880" w:type="dxa"/>
           </w:tcPr>
           <w:p>
-            <w:pPr>
-              <w:cnfStyle w:val="000000010000" w:firstRow="0" w:lastRow="0" w:firstColumn="0" w:lastColumn="0" w:oddVBand="0" w:evenVBand="0" w:oddHBand="0" w:evenHBand="1" w:firstRowFirstColumn="0" w:firstRowLastColumn="0" w:lastRowFirstColumn="0" w:lastRowLastColumn="0"/>
-            </w:pPr>
             <w:r>
               <w:t>___ / 5</w:t>
             </w:r>
@@ -541,23 +360,15 @@
         </w:tc>
         <w:tc>
           <w:tcPr>
-            <w:tcW w:w="3969" w:type="dxa"/>
+            <w:tcW w:w="2880" w:type="dxa"/>
           </w:tcPr>
-          <w:p>
-            <w:pPr>
-              <w:cnfStyle w:val="000000010000" w:firstRow="0" w:lastRow="0" w:firstColumn="0" w:lastColumn="0" w:oddVBand="0" w:evenVBand="0" w:oddHBand="0" w:evenHBand="1" w:firstRowFirstColumn="0" w:firstRowLastColumn="0" w:lastRowFirstColumn="0" w:lastRowLastColumn="0"/>
-            </w:pPr>
-          </w:p>
+          <w:p/>
         </w:tc>
       </w:tr>
       <w:tr>
-        <w:trPr>
-          <w:cnfStyle w:val="000000100000" w:firstRow="0" w:lastRow="0" w:firstColumn="0" w:lastColumn="0" w:oddVBand="0" w:evenVBand="0" w:oddHBand="1" w:evenHBand="0" w:firstRowFirstColumn="0" w:firstRowLastColumn="0" w:lastRowFirstColumn="0" w:lastRowLastColumn="0"/>
-        </w:trPr>
         <w:tc>
           <w:tcPr>
-            <w:cnfStyle w:val="001000000000" w:firstRow="0" w:lastRow="0" w:firstColumn="1" w:lastColumn="0" w:oddVBand="0" w:evenVBand="0" w:oddHBand="0" w:evenHBand="0" w:firstRowFirstColumn="0" w:firstRowLastColumn="0" w:lastRowFirstColumn="0" w:lastRowLastColumn="0"/>
-            <w:tcW w:w="5040" w:type="dxa"/>
+            <w:tcW w:w="2880" w:type="dxa"/>
           </w:tcPr>
           <w:p>
             <w:r>
@@ -567,12 +378,9 @@
         </w:tc>
         <w:tc>
           <w:tcPr>
-            <w:tcW w:w="1022" w:type="dxa"/>
+            <w:tcW w:w="2880" w:type="dxa"/>
           </w:tcPr>
           <w:p>
-            <w:pPr>
-              <w:cnfStyle w:val="000000100000" w:firstRow="0" w:lastRow="0" w:firstColumn="0" w:lastColumn="0" w:oddVBand="0" w:evenVBand="0" w:oddHBand="1" w:evenHBand="0" w:firstRowFirstColumn="0" w:firstRowLastColumn="0" w:lastRowFirstColumn="0" w:lastRowLastColumn="0"/>
-            </w:pPr>
             <w:r>
               <w:t>___ / 5</w:t>
             </w:r>
@@ -580,23 +388,15 @@
         </w:tc>
         <w:tc>
           <w:tcPr>
-            <w:tcW w:w="3969" w:type="dxa"/>
+            <w:tcW w:w="2880" w:type="dxa"/>
           </w:tcPr>
-          <w:p>
-            <w:pPr>
-              <w:cnfStyle w:val="000000100000" w:firstRow="0" w:lastRow="0" w:firstColumn="0" w:lastColumn="0" w:oddVBand="0" w:evenVBand="0" w:oddHBand="1" w:evenHBand="0" w:firstRowFirstColumn="0" w:firstRowLastColumn="0" w:lastRowFirstColumn="0" w:lastRowLastColumn="0"/>
-            </w:pPr>
-          </w:p>
+          <w:p/>
         </w:tc>
       </w:tr>
       <w:tr>
-        <w:trPr>
-          <w:cnfStyle w:val="000000010000" w:firstRow="0" w:lastRow="0" w:firstColumn="0" w:lastColumn="0" w:oddVBand="0" w:evenVBand="0" w:oddHBand="0" w:evenHBand="1" w:firstRowFirstColumn="0" w:firstRowLastColumn="0" w:lastRowFirstColumn="0" w:lastRowLastColumn="0"/>
-        </w:trPr>
         <w:tc>
           <w:tcPr>
-            <w:cnfStyle w:val="001000000000" w:firstRow="0" w:lastRow="0" w:firstColumn="1" w:lastColumn="0" w:oddVBand="0" w:evenVBand="0" w:oddHBand="0" w:evenHBand="0" w:firstRowFirstColumn="0" w:firstRowLastColumn="0" w:lastRowFirstColumn="0" w:lastRowLastColumn="0"/>
-            <w:tcW w:w="5040" w:type="dxa"/>
+            <w:tcW w:w="2880" w:type="dxa"/>
           </w:tcPr>
           <w:p>
             <w:r>
@@ -606,12 +406,9 @@
         </w:tc>
         <w:tc>
           <w:tcPr>
-            <w:tcW w:w="1022" w:type="dxa"/>
+            <w:tcW w:w="2880" w:type="dxa"/>
           </w:tcPr>
           <w:p>
-            <w:pPr>
-              <w:cnfStyle w:val="000000010000" w:firstRow="0" w:lastRow="0" w:firstColumn="0" w:lastColumn="0" w:oddVBand="0" w:evenVBand="0" w:oddHBand="0" w:evenHBand="1" w:firstRowFirstColumn="0" w:firstRowLastColumn="0" w:lastRowFirstColumn="0" w:lastRowLastColumn="0"/>
-            </w:pPr>
             <w:r>
               <w:t>___ / 5</w:t>
             </w:r>
@@ -619,24 +416,15 @@
         </w:tc>
         <w:tc>
           <w:tcPr>
-            <w:tcW w:w="3969" w:type="dxa"/>
+            <w:tcW w:w="2880" w:type="dxa"/>
           </w:tcPr>
-          <w:p>
-            <w:pPr>
-              <w:ind w:right="1234"/>
-              <w:cnfStyle w:val="000000010000" w:firstRow="0" w:lastRow="0" w:firstColumn="0" w:lastColumn="0" w:oddVBand="0" w:evenVBand="0" w:oddHBand="0" w:evenHBand="1" w:firstRowFirstColumn="0" w:firstRowLastColumn="0" w:lastRowFirstColumn="0" w:lastRowLastColumn="0"/>
-            </w:pPr>
-          </w:p>
+          <w:p/>
         </w:tc>
       </w:tr>
       <w:tr>
-        <w:trPr>
-          <w:cnfStyle w:val="000000100000" w:firstRow="0" w:lastRow="0" w:firstColumn="0" w:lastColumn="0" w:oddVBand="0" w:evenVBand="0" w:oddHBand="1" w:evenHBand="0" w:firstRowFirstColumn="0" w:firstRowLastColumn="0" w:lastRowFirstColumn="0" w:lastRowLastColumn="0"/>
-        </w:trPr>
         <w:tc>
           <w:tcPr>
-            <w:cnfStyle w:val="001000000000" w:firstRow="0" w:lastRow="0" w:firstColumn="1" w:lastColumn="0" w:oddVBand="0" w:evenVBand="0" w:oddHBand="0" w:evenHBand="0" w:firstRowFirstColumn="0" w:firstRowLastColumn="0" w:lastRowFirstColumn="0" w:lastRowLastColumn="0"/>
-            <w:tcW w:w="5040" w:type="dxa"/>
+            <w:tcW w:w="2880" w:type="dxa"/>
           </w:tcPr>
           <w:p>
             <w:r>
@@ -646,12 +434,9 @@
         </w:tc>
         <w:tc>
           <w:tcPr>
-            <w:tcW w:w="1022" w:type="dxa"/>
+            <w:tcW w:w="2880" w:type="dxa"/>
           </w:tcPr>
           <w:p>
-            <w:pPr>
-              <w:cnfStyle w:val="000000100000" w:firstRow="0" w:lastRow="0" w:firstColumn="0" w:lastColumn="0" w:oddVBand="0" w:evenVBand="0" w:oddHBand="1" w:evenHBand="0" w:firstRowFirstColumn="0" w:firstRowLastColumn="0" w:lastRowFirstColumn="0" w:lastRowLastColumn="0"/>
-            </w:pPr>
             <w:r>
               <w:t>___ / 5</w:t>
             </w:r>
@@ -659,48 +444,36 @@
         </w:tc>
         <w:tc>
           <w:tcPr>
-            <w:tcW w:w="3969" w:type="dxa"/>
+            <w:tcW w:w="2880" w:type="dxa"/>
           </w:tcPr>
-          <w:p>
-            <w:pPr>
-              <w:cnfStyle w:val="000000100000" w:firstRow="0" w:lastRow="0" w:firstColumn="0" w:lastColumn="0" w:oddVBand="0" w:evenVBand="0" w:oddHBand="1" w:evenHBand="0" w:firstRowFirstColumn="0" w:firstRowLastColumn="0" w:lastRowFirstColumn="0" w:lastRowLastColumn="0"/>
-            </w:pPr>
-          </w:p>
+          <w:p/>
         </w:tc>
       </w:tr>
     </w:tbl>
-    <w:p>
-      <w:r>
-        <w:br/>
-      </w:r>
-    </w:p>
+    <w:p/>
     <w:p>
       <w:pPr>
         <w:pStyle w:val="Heading2"/>
       </w:pPr>
       <w:r>
+        <w:lastRenderedPageBreak/>
         <w:t>3. Compliance &amp; Risk Management</w:t>
       </w:r>
     </w:p>
     <w:tbl>
       <w:tblPr>
-        <w:tblStyle w:val="LightGrid-Accent1"/>
-        <w:tblW w:w="10031" w:type="dxa"/>
-        <w:tblLayout w:type="fixed"/>
+        <w:tblStyle w:val="TableGrid"/>
+        <w:tblW w:w="0" w:type="auto"/>
         <w:tblLook w:val="04A0" w:firstRow="1" w:lastRow="0" w:firstColumn="1" w:lastColumn="0" w:noHBand="0" w:noVBand="1"/>
       </w:tblPr>
       <w:tblGrid>
-        <w:gridCol w:w="5040"/>
-        <w:gridCol w:w="1022"/>
-        <w:gridCol w:w="3969"/>
+        <w:gridCol w:w="4173"/>
+        <w:gridCol w:w="2339"/>
+        <w:gridCol w:w="2344"/>
       </w:tblGrid>
       <w:tr>
-        <w:trPr>
-          <w:cnfStyle w:val="100000000000" w:firstRow="1" w:lastRow="0" w:firstColumn="0" w:lastColumn="0" w:oddVBand="0" w:evenVBand="0" w:oddHBand="0" w:evenHBand="0" w:firstRowFirstColumn="0" w:firstRowLastColumn="0" w:lastRowFirstColumn="0" w:lastRowLastColumn="0"/>
-        </w:trPr>
         <w:tc>
           <w:tcPr>
-            <w:cnfStyle w:val="001000000000" w:firstRow="0" w:lastRow="0" w:firstColumn="1" w:lastColumn="0" w:oddVBand="0" w:evenVBand="0" w:oddHBand="0" w:evenHBand="0" w:firstRowFirstColumn="0" w:firstRowLastColumn="0" w:lastRowFirstColumn="0" w:lastRowLastColumn="0"/>
             <w:tcW w:w="5040" w:type="dxa"/>
           </w:tcPr>
           <w:p>
@@ -711,12 +484,9 @@
         </w:tc>
         <w:tc>
           <w:tcPr>
-            <w:tcW w:w="1022" w:type="dxa"/>
+            <w:tcW w:w="1440" w:type="dxa"/>
           </w:tcPr>
           <w:p>
-            <w:pPr>
-              <w:cnfStyle w:val="100000000000" w:firstRow="1" w:lastRow="0" w:firstColumn="0" w:lastColumn="0" w:oddVBand="0" w:evenVBand="0" w:oddHBand="0" w:evenHBand="0" w:firstRowFirstColumn="0" w:firstRowLastColumn="0" w:lastRowFirstColumn="0" w:lastRowLastColumn="0"/>
-            </w:pPr>
             <w:r>
               <w:t>Score (1-5)</w:t>
             </w:r>
@@ -724,12 +494,9 @@
         </w:tc>
         <w:tc>
           <w:tcPr>
-            <w:tcW w:w="3969" w:type="dxa"/>
+            <w:tcW w:w="2880" w:type="dxa"/>
           </w:tcPr>
           <w:p>
-            <w:pPr>
-              <w:cnfStyle w:val="100000000000" w:firstRow="1" w:lastRow="0" w:firstColumn="0" w:lastColumn="0" w:oddVBand="0" w:evenVBand="0" w:oddHBand="0" w:evenHBand="0" w:firstRowFirstColumn="0" w:firstRowLastColumn="0" w:lastRowFirstColumn="0" w:lastRowLastColumn="0"/>
-            </w:pPr>
             <w:r>
               <w:t>Notes / Red Flags</w:t>
             </w:r>
@@ -737,13 +504,9 @@
         </w:tc>
       </w:tr>
       <w:tr>
-        <w:trPr>
-          <w:cnfStyle w:val="000000100000" w:firstRow="0" w:lastRow="0" w:firstColumn="0" w:lastColumn="0" w:oddVBand="0" w:evenVBand="0" w:oddHBand="1" w:evenHBand="0" w:firstRowFirstColumn="0" w:firstRowLastColumn="0" w:lastRowFirstColumn="0" w:lastRowLastColumn="0"/>
-        </w:trPr>
         <w:tc>
           <w:tcPr>
-            <w:cnfStyle w:val="001000000000" w:firstRow="0" w:lastRow="0" w:firstColumn="1" w:lastColumn="0" w:oddVBand="0" w:evenVBand="0" w:oddHBand="0" w:evenHBand="0" w:firstRowFirstColumn="0" w:firstRowLastColumn="0" w:lastRowFirstColumn="0" w:lastRowLastColumn="0"/>
-            <w:tcW w:w="5040" w:type="dxa"/>
+            <w:tcW w:w="2880" w:type="dxa"/>
           </w:tcPr>
           <w:p>
             <w:r>
@@ -753,12 +516,9 @@
         </w:tc>
         <w:tc>
           <w:tcPr>
-            <w:tcW w:w="1022" w:type="dxa"/>
+            <w:tcW w:w="2880" w:type="dxa"/>
           </w:tcPr>
           <w:p>
-            <w:pPr>
-              <w:cnfStyle w:val="000000100000" w:firstRow="0" w:lastRow="0" w:firstColumn="0" w:lastColumn="0" w:oddVBand="0" w:evenVBand="0" w:oddHBand="1" w:evenHBand="0" w:firstRowFirstColumn="0" w:firstRowLastColumn="0" w:lastRowFirstColumn="0" w:lastRowLastColumn="0"/>
-            </w:pPr>
             <w:r>
               <w:t>___ / 5</w:t>
             </w:r>
@@ -766,23 +526,15 @@
         </w:tc>
         <w:tc>
           <w:tcPr>
-            <w:tcW w:w="3969" w:type="dxa"/>
+            <w:tcW w:w="2880" w:type="dxa"/>
           </w:tcPr>
-          <w:p>
-            <w:pPr>
-              <w:cnfStyle w:val="000000100000" w:firstRow="0" w:lastRow="0" w:firstColumn="0" w:lastColumn="0" w:oddVBand="0" w:evenVBand="0" w:oddHBand="1" w:evenHBand="0" w:firstRowFirstColumn="0" w:firstRowLastColumn="0" w:lastRowFirstColumn="0" w:lastRowLastColumn="0"/>
-            </w:pPr>
-          </w:p>
+          <w:p/>
         </w:tc>
       </w:tr>
       <w:tr>
-        <w:trPr>
-          <w:cnfStyle w:val="000000010000" w:firstRow="0" w:lastRow="0" w:firstColumn="0" w:lastColumn="0" w:oddVBand="0" w:evenVBand="0" w:oddHBand="0" w:evenHBand="1" w:firstRowFirstColumn="0" w:firstRowLastColumn="0" w:lastRowFirstColumn="0" w:lastRowLastColumn="0"/>
-        </w:trPr>
         <w:tc>
           <w:tcPr>
-            <w:cnfStyle w:val="001000000000" w:firstRow="0" w:lastRow="0" w:firstColumn="1" w:lastColumn="0" w:oddVBand="0" w:evenVBand="0" w:oddHBand="0" w:evenHBand="0" w:firstRowFirstColumn="0" w:firstRowLastColumn="0" w:lastRowFirstColumn="0" w:lastRowLastColumn="0"/>
-            <w:tcW w:w="5040" w:type="dxa"/>
+            <w:tcW w:w="2880" w:type="dxa"/>
           </w:tcPr>
           <w:p>
             <w:r>
@@ -792,12 +544,9 @@
         </w:tc>
         <w:tc>
           <w:tcPr>
-            <w:tcW w:w="1022" w:type="dxa"/>
+            <w:tcW w:w="2880" w:type="dxa"/>
           </w:tcPr>
           <w:p>
-            <w:pPr>
-              <w:cnfStyle w:val="000000010000" w:firstRow="0" w:lastRow="0" w:firstColumn="0" w:lastColumn="0" w:oddVBand="0" w:evenVBand="0" w:oddHBand="0" w:evenHBand="1" w:firstRowFirstColumn="0" w:firstRowLastColumn="0" w:lastRowFirstColumn="0" w:lastRowLastColumn="0"/>
-            </w:pPr>
             <w:r>
               <w:t>___ / 5</w:t>
             </w:r>
@@ -805,23 +554,15 @@
         </w:tc>
         <w:tc>
           <w:tcPr>
-            <w:tcW w:w="3969" w:type="dxa"/>
+            <w:tcW w:w="2880" w:type="dxa"/>
           </w:tcPr>
-          <w:p>
-            <w:pPr>
-              <w:cnfStyle w:val="000000010000" w:firstRow="0" w:lastRow="0" w:firstColumn="0" w:lastColumn="0" w:oddVBand="0" w:evenVBand="0" w:oddHBand="0" w:evenHBand="1" w:firstRowFirstColumn="0" w:firstRowLastColumn="0" w:lastRowFirstColumn="0" w:lastRowLastColumn="0"/>
-            </w:pPr>
-          </w:p>
+          <w:p/>
         </w:tc>
       </w:tr>
       <w:tr>
-        <w:trPr>
-          <w:cnfStyle w:val="000000100000" w:firstRow="0" w:lastRow="0" w:firstColumn="0" w:lastColumn="0" w:oddVBand="0" w:evenVBand="0" w:oddHBand="1" w:evenHBand="0" w:firstRowFirstColumn="0" w:firstRowLastColumn="0" w:lastRowFirstColumn="0" w:lastRowLastColumn="0"/>
-        </w:trPr>
         <w:tc>
           <w:tcPr>
-            <w:cnfStyle w:val="001000000000" w:firstRow="0" w:lastRow="0" w:firstColumn="1" w:lastColumn="0" w:oddVBand="0" w:evenVBand="0" w:oddHBand="0" w:evenHBand="0" w:firstRowFirstColumn="0" w:firstRowLastColumn="0" w:lastRowFirstColumn="0" w:lastRowLastColumn="0"/>
-            <w:tcW w:w="5040" w:type="dxa"/>
+            <w:tcW w:w="2880" w:type="dxa"/>
           </w:tcPr>
           <w:p>
             <w:r>
@@ -831,12 +572,9 @@
         </w:tc>
         <w:tc>
           <w:tcPr>
-            <w:tcW w:w="1022" w:type="dxa"/>
+            <w:tcW w:w="2880" w:type="dxa"/>
           </w:tcPr>
           <w:p>
-            <w:pPr>
-              <w:cnfStyle w:val="000000100000" w:firstRow="0" w:lastRow="0" w:firstColumn="0" w:lastColumn="0" w:oddVBand="0" w:evenVBand="0" w:oddHBand="1" w:evenHBand="0" w:firstRowFirstColumn="0" w:firstRowLastColumn="0" w:lastRowFirstColumn="0" w:lastRowLastColumn="0"/>
-            </w:pPr>
             <w:r>
               <w:t>___ / 5</w:t>
             </w:r>
@@ -844,23 +582,15 @@
         </w:tc>
         <w:tc>
           <w:tcPr>
-            <w:tcW w:w="3969" w:type="dxa"/>
+            <w:tcW w:w="2880" w:type="dxa"/>
           </w:tcPr>
-          <w:p>
-            <w:pPr>
-              <w:cnfStyle w:val="000000100000" w:firstRow="0" w:lastRow="0" w:firstColumn="0" w:lastColumn="0" w:oddVBand="0" w:evenVBand="0" w:oddHBand="1" w:evenHBand="0" w:firstRowFirstColumn="0" w:firstRowLastColumn="0" w:lastRowFirstColumn="0" w:lastRowLastColumn="0"/>
-            </w:pPr>
-          </w:p>
+          <w:p/>
         </w:tc>
       </w:tr>
       <w:tr>
-        <w:trPr>
-          <w:cnfStyle w:val="000000010000" w:firstRow="0" w:lastRow="0" w:firstColumn="0" w:lastColumn="0" w:oddVBand="0" w:evenVBand="0" w:oddHBand="0" w:evenHBand="1" w:firstRowFirstColumn="0" w:firstRowLastColumn="0" w:lastRowFirstColumn="0" w:lastRowLastColumn="0"/>
-        </w:trPr>
         <w:tc>
           <w:tcPr>
-            <w:cnfStyle w:val="001000000000" w:firstRow="0" w:lastRow="0" w:firstColumn="1" w:lastColumn="0" w:oddVBand="0" w:evenVBand="0" w:oddHBand="0" w:evenHBand="0" w:firstRowFirstColumn="0" w:firstRowLastColumn="0" w:lastRowFirstColumn="0" w:lastRowLastColumn="0"/>
-            <w:tcW w:w="5040" w:type="dxa"/>
+            <w:tcW w:w="2880" w:type="dxa"/>
           </w:tcPr>
           <w:p>
             <w:r>
@@ -870,12 +600,9 @@
         </w:tc>
         <w:tc>
           <w:tcPr>
-            <w:tcW w:w="1022" w:type="dxa"/>
+            <w:tcW w:w="2880" w:type="dxa"/>
           </w:tcPr>
           <w:p>
-            <w:pPr>
-              <w:cnfStyle w:val="000000010000" w:firstRow="0" w:lastRow="0" w:firstColumn="0" w:lastColumn="0" w:oddVBand="0" w:evenVBand="0" w:oddHBand="0" w:evenHBand="1" w:firstRowFirstColumn="0" w:firstRowLastColumn="0" w:lastRowFirstColumn="0" w:lastRowLastColumn="0"/>
-            </w:pPr>
             <w:r>
               <w:t>___ / 5</w:t>
             </w:r>
@@ -883,23 +610,15 @@
         </w:tc>
         <w:tc>
           <w:tcPr>
-            <w:tcW w:w="3969" w:type="dxa"/>
+            <w:tcW w:w="2880" w:type="dxa"/>
           </w:tcPr>
-          <w:p>
-            <w:pPr>
-              <w:cnfStyle w:val="000000010000" w:firstRow="0" w:lastRow="0" w:firstColumn="0" w:lastColumn="0" w:oddVBand="0" w:evenVBand="0" w:oddHBand="0" w:evenHBand="1" w:firstRowFirstColumn="0" w:firstRowLastColumn="0" w:lastRowFirstColumn="0" w:lastRowLastColumn="0"/>
-            </w:pPr>
-          </w:p>
+          <w:p/>
         </w:tc>
       </w:tr>
       <w:tr>
-        <w:trPr>
-          <w:cnfStyle w:val="000000100000" w:firstRow="0" w:lastRow="0" w:firstColumn="0" w:lastColumn="0" w:oddVBand="0" w:evenVBand="0" w:oddHBand="1" w:evenHBand="0" w:firstRowFirstColumn="0" w:firstRowLastColumn="0" w:lastRowFirstColumn="0" w:lastRowLastColumn="0"/>
-        </w:trPr>
         <w:tc>
           <w:tcPr>
-            <w:cnfStyle w:val="001000000000" w:firstRow="0" w:lastRow="0" w:firstColumn="1" w:lastColumn="0" w:oddVBand="0" w:evenVBand="0" w:oddHBand="0" w:evenHBand="0" w:firstRowFirstColumn="0" w:firstRowLastColumn="0" w:lastRowFirstColumn="0" w:lastRowLastColumn="0"/>
-            <w:tcW w:w="5040" w:type="dxa"/>
+            <w:tcW w:w="2880" w:type="dxa"/>
           </w:tcPr>
           <w:p>
             <w:r>
@@ -909,12 +628,9 @@
         </w:tc>
         <w:tc>
           <w:tcPr>
-            <w:tcW w:w="1022" w:type="dxa"/>
+            <w:tcW w:w="2880" w:type="dxa"/>
           </w:tcPr>
           <w:p>
-            <w:pPr>
-              <w:cnfStyle w:val="000000100000" w:firstRow="0" w:lastRow="0" w:firstColumn="0" w:lastColumn="0" w:oddVBand="0" w:evenVBand="0" w:oddHBand="1" w:evenHBand="0" w:firstRowFirstColumn="0" w:firstRowLastColumn="0" w:lastRowFirstColumn="0" w:lastRowLastColumn="0"/>
-            </w:pPr>
             <w:r>
               <w:t>___ / 5</w:t>
             </w:r>
@@ -922,21 +638,13 @@
         </w:tc>
         <w:tc>
           <w:tcPr>
-            <w:tcW w:w="3969" w:type="dxa"/>
+            <w:tcW w:w="2880" w:type="dxa"/>
           </w:tcPr>
-          <w:p>
-            <w:pPr>
-              <w:cnfStyle w:val="000000100000" w:firstRow="0" w:lastRow="0" w:firstColumn="0" w:lastColumn="0" w:oddVBand="0" w:evenVBand="0" w:oddHBand="1" w:evenHBand="0" w:firstRowFirstColumn="0" w:firstRowLastColumn="0" w:lastRowFirstColumn="0" w:lastRowLastColumn="0"/>
-            </w:pPr>
-          </w:p>
+          <w:p/>
         </w:tc>
       </w:tr>
     </w:tbl>
-    <w:p>
-      <w:r>
-        <w:br/>
-      </w:r>
-    </w:p>
+    <w:p/>
     <w:p>
       <w:pPr>
         <w:pStyle w:val="Heading2"/>
@@ -947,23 +655,18 @@
     </w:p>
     <w:tbl>
       <w:tblPr>
-        <w:tblStyle w:val="LightGrid-Accent1"/>
-        <w:tblW w:w="10031" w:type="dxa"/>
-        <w:tblLayout w:type="fixed"/>
+        <w:tblStyle w:val="TableGrid"/>
+        <w:tblW w:w="0" w:type="auto"/>
         <w:tblLook w:val="04A0" w:firstRow="1" w:lastRow="0" w:firstColumn="1" w:lastColumn="0" w:noHBand="0" w:noVBand="1"/>
       </w:tblPr>
       <w:tblGrid>
-        <w:gridCol w:w="5040"/>
-        <w:gridCol w:w="1022"/>
-        <w:gridCol w:w="3969"/>
+        <w:gridCol w:w="4129"/>
+        <w:gridCol w:w="2361"/>
+        <w:gridCol w:w="2366"/>
       </w:tblGrid>
       <w:tr>
-        <w:trPr>
-          <w:cnfStyle w:val="100000000000" w:firstRow="1" w:lastRow="0" w:firstColumn="0" w:lastColumn="0" w:oddVBand="0" w:evenVBand="0" w:oddHBand="0" w:evenHBand="0" w:firstRowFirstColumn="0" w:firstRowLastColumn="0" w:lastRowFirstColumn="0" w:lastRowLastColumn="0"/>
-        </w:trPr>
         <w:tc>
           <w:tcPr>
-            <w:cnfStyle w:val="001000000000" w:firstRow="0" w:lastRow="0" w:firstColumn="1" w:lastColumn="0" w:oddVBand="0" w:evenVBand="0" w:oddHBand="0" w:evenHBand="0" w:firstRowFirstColumn="0" w:firstRowLastColumn="0" w:lastRowFirstColumn="0" w:lastRowLastColumn="0"/>
             <w:tcW w:w="5040" w:type="dxa"/>
           </w:tcPr>
           <w:p>
@@ -974,12 +677,9 @@
         </w:tc>
         <w:tc>
           <w:tcPr>
-            <w:tcW w:w="1022" w:type="dxa"/>
+            <w:tcW w:w="1440" w:type="dxa"/>
           </w:tcPr>
           <w:p>
-            <w:pPr>
-              <w:cnfStyle w:val="100000000000" w:firstRow="1" w:lastRow="0" w:firstColumn="0" w:lastColumn="0" w:oddVBand="0" w:evenVBand="0" w:oddHBand="0" w:evenHBand="0" w:firstRowFirstColumn="0" w:firstRowLastColumn="0" w:lastRowFirstColumn="0" w:lastRowLastColumn="0"/>
-            </w:pPr>
             <w:r>
               <w:t>Score (1-5)</w:t>
             </w:r>
@@ -987,12 +687,9 @@
         </w:tc>
         <w:tc>
           <w:tcPr>
-            <w:tcW w:w="3969" w:type="dxa"/>
+            <w:tcW w:w="2880" w:type="dxa"/>
           </w:tcPr>
           <w:p>
-            <w:pPr>
-              <w:cnfStyle w:val="100000000000" w:firstRow="1" w:lastRow="0" w:firstColumn="0" w:lastColumn="0" w:oddVBand="0" w:evenVBand="0" w:oddHBand="0" w:evenHBand="0" w:firstRowFirstColumn="0" w:firstRowLastColumn="0" w:lastRowFirstColumn="0" w:lastRowLastColumn="0"/>
-            </w:pPr>
             <w:r>
               <w:t>Notes / Red Flags</w:t>
             </w:r>
@@ -1000,13 +697,9 @@
         </w:tc>
       </w:tr>
       <w:tr>
-        <w:trPr>
-          <w:cnfStyle w:val="000000100000" w:firstRow="0" w:lastRow="0" w:firstColumn="0" w:lastColumn="0" w:oddVBand="0" w:evenVBand="0" w:oddHBand="1" w:evenHBand="0" w:firstRowFirstColumn="0" w:firstRowLastColumn="0" w:lastRowFirstColumn="0" w:lastRowLastColumn="0"/>
-        </w:trPr>
         <w:tc>
           <w:tcPr>
-            <w:cnfStyle w:val="001000000000" w:firstRow="0" w:lastRow="0" w:firstColumn="1" w:lastColumn="0" w:oddVBand="0" w:evenVBand="0" w:oddHBand="0" w:evenHBand="0" w:firstRowFirstColumn="0" w:firstRowLastColumn="0" w:lastRowFirstColumn="0" w:lastRowLastColumn="0"/>
-            <w:tcW w:w="5040" w:type="dxa"/>
+            <w:tcW w:w="2880" w:type="dxa"/>
           </w:tcPr>
           <w:p>
             <w:r>
@@ -1016,12 +709,9 @@
         </w:tc>
         <w:tc>
           <w:tcPr>
-            <w:tcW w:w="1022" w:type="dxa"/>
+            <w:tcW w:w="2880" w:type="dxa"/>
           </w:tcPr>
           <w:p>
-            <w:pPr>
-              <w:cnfStyle w:val="000000100000" w:firstRow="0" w:lastRow="0" w:firstColumn="0" w:lastColumn="0" w:oddVBand="0" w:evenVBand="0" w:oddHBand="1" w:evenHBand="0" w:firstRowFirstColumn="0" w:firstRowLastColumn="0" w:lastRowFirstColumn="0" w:lastRowLastColumn="0"/>
-            </w:pPr>
             <w:r>
               <w:t>___ / 5</w:t>
             </w:r>
@@ -1029,23 +719,15 @@
         </w:tc>
         <w:tc>
           <w:tcPr>
-            <w:tcW w:w="3969" w:type="dxa"/>
+            <w:tcW w:w="2880" w:type="dxa"/>
           </w:tcPr>
-          <w:p>
-            <w:pPr>
-              <w:cnfStyle w:val="000000100000" w:firstRow="0" w:lastRow="0" w:firstColumn="0" w:lastColumn="0" w:oddVBand="0" w:evenVBand="0" w:oddHBand="1" w:evenHBand="0" w:firstRowFirstColumn="0" w:firstRowLastColumn="0" w:lastRowFirstColumn="0" w:lastRowLastColumn="0"/>
-            </w:pPr>
-          </w:p>
+          <w:p/>
         </w:tc>
       </w:tr>
       <w:tr>
-        <w:trPr>
-          <w:cnfStyle w:val="000000010000" w:firstRow="0" w:lastRow="0" w:firstColumn="0" w:lastColumn="0" w:oddVBand="0" w:evenVBand="0" w:oddHBand="0" w:evenHBand="1" w:firstRowFirstColumn="0" w:firstRowLastColumn="0" w:lastRowFirstColumn="0" w:lastRowLastColumn="0"/>
-        </w:trPr>
         <w:tc>
           <w:tcPr>
-            <w:cnfStyle w:val="001000000000" w:firstRow="0" w:lastRow="0" w:firstColumn="1" w:lastColumn="0" w:oddVBand="0" w:evenVBand="0" w:oddHBand="0" w:evenHBand="0" w:firstRowFirstColumn="0" w:firstRowLastColumn="0" w:lastRowFirstColumn="0" w:lastRowLastColumn="0"/>
-            <w:tcW w:w="5040" w:type="dxa"/>
+            <w:tcW w:w="2880" w:type="dxa"/>
           </w:tcPr>
           <w:p>
             <w:r>
@@ -1055,12 +737,9 @@
         </w:tc>
         <w:tc>
           <w:tcPr>
-            <w:tcW w:w="1022" w:type="dxa"/>
+            <w:tcW w:w="2880" w:type="dxa"/>
           </w:tcPr>
           <w:p>
-            <w:pPr>
-              <w:cnfStyle w:val="000000010000" w:firstRow="0" w:lastRow="0" w:firstColumn="0" w:lastColumn="0" w:oddVBand="0" w:evenVBand="0" w:oddHBand="0" w:evenHBand="1" w:firstRowFirstColumn="0" w:firstRowLastColumn="0" w:lastRowFirstColumn="0" w:lastRowLastColumn="0"/>
-            </w:pPr>
             <w:r>
               <w:t>___ / 5</w:t>
             </w:r>
@@ -1068,23 +747,15 @@
         </w:tc>
         <w:tc>
           <w:tcPr>
-            <w:tcW w:w="3969" w:type="dxa"/>
+            <w:tcW w:w="2880" w:type="dxa"/>
           </w:tcPr>
-          <w:p>
-            <w:pPr>
-              <w:cnfStyle w:val="000000010000" w:firstRow="0" w:lastRow="0" w:firstColumn="0" w:lastColumn="0" w:oddVBand="0" w:evenVBand="0" w:oddHBand="0" w:evenHBand="1" w:firstRowFirstColumn="0" w:firstRowLastColumn="0" w:lastRowFirstColumn="0" w:lastRowLastColumn="0"/>
-            </w:pPr>
-          </w:p>
+          <w:p/>
         </w:tc>
       </w:tr>
       <w:tr>
-        <w:trPr>
-          <w:cnfStyle w:val="000000100000" w:firstRow="0" w:lastRow="0" w:firstColumn="0" w:lastColumn="0" w:oddVBand="0" w:evenVBand="0" w:oddHBand="1" w:evenHBand="0" w:firstRowFirstColumn="0" w:firstRowLastColumn="0" w:lastRowFirstColumn="0" w:lastRowLastColumn="0"/>
-        </w:trPr>
         <w:tc>
           <w:tcPr>
-            <w:cnfStyle w:val="001000000000" w:firstRow="0" w:lastRow="0" w:firstColumn="1" w:lastColumn="0" w:oddVBand="0" w:evenVBand="0" w:oddHBand="0" w:evenHBand="0" w:firstRowFirstColumn="0" w:firstRowLastColumn="0" w:lastRowFirstColumn="0" w:lastRowLastColumn="0"/>
-            <w:tcW w:w="5040" w:type="dxa"/>
+            <w:tcW w:w="2880" w:type="dxa"/>
           </w:tcPr>
           <w:p>
             <w:r>
@@ -1094,12 +765,9 @@
         </w:tc>
         <w:tc>
           <w:tcPr>
-            <w:tcW w:w="1022" w:type="dxa"/>
+            <w:tcW w:w="2880" w:type="dxa"/>
           </w:tcPr>
           <w:p>
-            <w:pPr>
-              <w:cnfStyle w:val="000000100000" w:firstRow="0" w:lastRow="0" w:firstColumn="0" w:lastColumn="0" w:oddVBand="0" w:evenVBand="0" w:oddHBand="1" w:evenHBand="0" w:firstRowFirstColumn="0" w:firstRowLastColumn="0" w:lastRowFirstColumn="0" w:lastRowLastColumn="0"/>
-            </w:pPr>
             <w:r>
               <w:t>___ / 5</w:t>
             </w:r>
@@ -1107,23 +775,15 @@
         </w:tc>
         <w:tc>
           <w:tcPr>
-            <w:tcW w:w="3969" w:type="dxa"/>
+            <w:tcW w:w="2880" w:type="dxa"/>
           </w:tcPr>
-          <w:p>
-            <w:pPr>
-              <w:cnfStyle w:val="000000100000" w:firstRow="0" w:lastRow="0" w:firstColumn="0" w:lastColumn="0" w:oddVBand="0" w:evenVBand="0" w:oddHBand="1" w:evenHBand="0" w:firstRowFirstColumn="0" w:firstRowLastColumn="0" w:lastRowFirstColumn="0" w:lastRowLastColumn="0"/>
-            </w:pPr>
-          </w:p>
+          <w:p/>
         </w:tc>
       </w:tr>
       <w:tr>
-        <w:trPr>
-          <w:cnfStyle w:val="000000010000" w:firstRow="0" w:lastRow="0" w:firstColumn="0" w:lastColumn="0" w:oddVBand="0" w:evenVBand="0" w:oddHBand="0" w:evenHBand="1" w:firstRowFirstColumn="0" w:firstRowLastColumn="0" w:lastRowFirstColumn="0" w:lastRowLastColumn="0"/>
-        </w:trPr>
         <w:tc>
           <w:tcPr>
-            <w:cnfStyle w:val="001000000000" w:firstRow="0" w:lastRow="0" w:firstColumn="1" w:lastColumn="0" w:oddVBand="0" w:evenVBand="0" w:oddHBand="0" w:evenHBand="0" w:firstRowFirstColumn="0" w:firstRowLastColumn="0" w:lastRowFirstColumn="0" w:lastRowLastColumn="0"/>
-            <w:tcW w:w="5040" w:type="dxa"/>
+            <w:tcW w:w="2880" w:type="dxa"/>
           </w:tcPr>
           <w:p>
             <w:r>
@@ -1133,12 +793,9 @@
         </w:tc>
         <w:tc>
           <w:tcPr>
-            <w:tcW w:w="1022" w:type="dxa"/>
+            <w:tcW w:w="2880" w:type="dxa"/>
           </w:tcPr>
           <w:p>
-            <w:pPr>
-              <w:cnfStyle w:val="000000010000" w:firstRow="0" w:lastRow="0" w:firstColumn="0" w:lastColumn="0" w:oddVBand="0" w:evenVBand="0" w:oddHBand="0" w:evenHBand="1" w:firstRowFirstColumn="0" w:firstRowLastColumn="0" w:lastRowFirstColumn="0" w:lastRowLastColumn="0"/>
-            </w:pPr>
             <w:r>
               <w:t>___ / 5</w:t>
             </w:r>
@@ -1146,78 +803,130 @@
         </w:tc>
         <w:tc>
           <w:tcPr>
-            <w:tcW w:w="3969" w:type="dxa"/>
+            <w:tcW w:w="2880" w:type="dxa"/>
           </w:tcPr>
-          <w:p>
-            <w:pPr>
-              <w:cnfStyle w:val="000000010000" w:firstRow="0" w:lastRow="0" w:firstColumn="0" w:lastColumn="0" w:oddVBand="0" w:evenVBand="0" w:oddHBand="0" w:evenHBand="1" w:firstRowFirstColumn="0" w:firstRowLastColumn="0" w:lastRowFirstColumn="0" w:lastRowLastColumn="0"/>
-            </w:pPr>
-          </w:p>
+          <w:p/>
         </w:tc>
       </w:tr>
     </w:tbl>
+    <w:p/>
+    <w:p>
+      <w:pPr>
+        <w:jc w:val="right"/>
+      </w:pPr>
+      <w:r>
+        <w:rPr>
+          <w:b/>
+        </w:rPr>
+        <w:t>Total Score for this Vendor: _______ / 100</w:t>
+      </w:r>
+    </w:p>
+    <w:p>
+      <w:pPr>
+        <w:rPr>
+          <w:color w:val="64748B"/>
+          <w:sz w:val="20"/>
+        </w:rPr>
+      </w:pPr>
+    </w:p>
+    <w:p>
+      <w:pPr>
+        <w:rPr>
+          <w:color w:val="64748B"/>
+          <w:sz w:val="20"/>
+        </w:rPr>
+      </w:pPr>
+    </w:p>
     <w:p>
       <w:r>
-        <w:br/>
+        <w:rPr>
+          <w:color w:val="64748B"/>
+          <w:sz w:val="20"/>
+        </w:rPr>
+        <w:t>F</w:t>
       </w:r>
       <w:r>
         <w:rPr>
+          <w:color w:val="64748B"/>
+          <w:sz w:val="20"/>
+        </w:rPr>
+        <w:t xml:space="preserve">or independent, verified software comparisons, visit </w:t>
+      </w:r>
+      <w:hyperlink r:id="rId6" w:history="1">
+        <w:r>
+          <w:rPr>
+            <w:rStyle w:val="Hyperlink"/>
+            <w:sz w:val="20"/>
+          </w:rPr>
+          <w:t>TheHRStackGuide.com</w:t>
+        </w:r>
+      </w:hyperlink>
+    </w:p>
+    <w:p>
+      <w:pPr>
+        <w:rPr>
+          <w:rFonts w:asciiTheme="majorHAnsi" w:eastAsiaTheme="majorEastAsia" w:hAnsiTheme="majorHAnsi" w:cstheme="majorBidi"/>
           <w:b/>
-          <w:sz w:val="28"/>
+          <w:bCs/>
+          <w:color w:val="4F81BD" w:themeColor="accent1"/>
+          <w:sz w:val="26"/>
+          <w:szCs w:val="26"/>
         </w:rPr>
-        <w:t>Total Score for this Vendor: _______ / 100</w:t>
+      </w:pPr>
+      <w:r>
+        <w:rPr>
+          <w:color w:val="64748B"/>
+          <w:sz w:val="20"/>
+        </w:rPr>
+        <w:t>Use our free Cost Calculators and Vendor Trade-offs to prepare for your next demo.</w:t>
       </w:r>
+    </w:p>
+    <w:p>
+      <w:pPr>
+        <w:rPr>
+          <w:rFonts w:asciiTheme="majorHAnsi" w:eastAsiaTheme="majorEastAsia" w:hAnsiTheme="majorHAnsi" w:cstheme="majorBidi"/>
+          <w:b/>
+          <w:bCs/>
+          <w:color w:val="4F81BD" w:themeColor="accent1"/>
+          <w:sz w:val="26"/>
+          <w:szCs w:val="26"/>
+        </w:rPr>
+      </w:pPr>
       <w:r>
         <w:br w:type="page"/>
       </w:r>
     </w:p>
     <w:p>
       <w:pPr>
-        <w:pStyle w:val="Heading1"/>
+        <w:pStyle w:val="Heading2"/>
       </w:pPr>
       <w:r>
         <w:lastRenderedPageBreak/>
-        <w:t>F</w:t>
-      </w:r>
-      <w:r>
-        <w:t>inal Executive Comparison</w:t>
+        <w:t>Final Executive Comparison</w:t>
       </w:r>
     </w:p>
     <w:p>
       <w:r>
-        <w:rPr>
-          <w:i/>
-        </w:rPr>
         <w:t>Instructions: Once all demos are complete, paste the total scores and estimated costs from your individual vendor sheets here to make a final procurement decision.</w:t>
-      </w:r>
-    </w:p>
-    <w:p>
-      <w:r>
-        <w:br/>
       </w:r>
     </w:p>
     <w:tbl>
       <w:tblPr>
-        <w:tblStyle w:val="MediumShading1-Accent1"/>
+        <w:tblStyle w:val="TableGrid"/>
         <w:tblW w:w="0" w:type="auto"/>
-        <w:tblLayout w:type="fixed"/>
         <w:tblLook w:val="04A0" w:firstRow="1" w:lastRow="0" w:firstColumn="1" w:lastColumn="0" w:noHBand="0" w:noVBand="1"/>
       </w:tblPr>
       <w:tblGrid>
-        <w:gridCol w:w="2160"/>
-        <w:gridCol w:w="1872"/>
-        <w:gridCol w:w="1872"/>
-        <w:gridCol w:w="1872"/>
-        <w:gridCol w:w="1872"/>
+        <w:gridCol w:w="1730"/>
+        <w:gridCol w:w="1728"/>
+        <w:gridCol w:w="1728"/>
+        <w:gridCol w:w="1728"/>
+        <w:gridCol w:w="1728"/>
       </w:tblGrid>
       <w:tr>
-        <w:trPr>
-          <w:cnfStyle w:val="100000000000" w:firstRow="1" w:lastRow="0" w:firstColumn="0" w:lastColumn="0" w:oddVBand="0" w:evenVBand="0" w:oddHBand="0" w:evenHBand="0" w:firstRowFirstColumn="0" w:firstRowLastColumn="0" w:lastRowFirstColumn="0" w:lastRowLastColumn="0"/>
-        </w:trPr>
         <w:tc>
           <w:tcPr>
-            <w:cnfStyle w:val="001000000000" w:firstRow="0" w:lastRow="0" w:firstColumn="1" w:lastColumn="0" w:oddVBand="0" w:evenVBand="0" w:oddHBand="0" w:evenHBand="0" w:firstRowFirstColumn="0" w:firstRowLastColumn="0" w:lastRowFirstColumn="0" w:lastRowLastColumn="0"/>
-            <w:tcW w:w="2160" w:type="dxa"/>
+            <w:tcW w:w="1728" w:type="dxa"/>
           </w:tcPr>
           <w:p>
             <w:r>
@@ -1227,81 +936,49 @@
         </w:tc>
         <w:tc>
           <w:tcPr>
-            <w:tcW w:w="1872" w:type="dxa"/>
+            <w:tcW w:w="1728" w:type="dxa"/>
           </w:tcPr>
           <w:p>
-            <w:pPr>
-              <w:cnfStyle w:val="100000000000" w:firstRow="1" w:lastRow="0" w:firstColumn="0" w:lastColumn="0" w:oddVBand="0" w:evenVBand="0" w:oddHBand="0" w:evenHBand="0" w:firstRowFirstColumn="0" w:firstRowLastColumn="0" w:lastRowFirstColumn="0" w:lastRowLastColumn="0"/>
-            </w:pPr>
             <w:r>
-              <w:t>Vendor 1:</w:t>
-            </w:r>
-            <w:r>
-              <w:br/>
-              <w:t>________________</w:t>
+              <w:t>Vendor 1:________________</w:t>
             </w:r>
           </w:p>
         </w:tc>
         <w:tc>
           <w:tcPr>
-            <w:tcW w:w="1872" w:type="dxa"/>
+            <w:tcW w:w="1728" w:type="dxa"/>
           </w:tcPr>
           <w:p>
-            <w:pPr>
-              <w:cnfStyle w:val="100000000000" w:firstRow="1" w:lastRow="0" w:firstColumn="0" w:lastColumn="0" w:oddVBand="0" w:evenVBand="0" w:oddHBand="0" w:evenHBand="0" w:firstRowFirstColumn="0" w:firstRowLastColumn="0" w:lastRowFirstColumn="0" w:lastRowLastColumn="0"/>
-            </w:pPr>
             <w:r>
-              <w:t>Vendor 2:</w:t>
-            </w:r>
-            <w:r>
-              <w:br/>
-              <w:t>________________</w:t>
+              <w:t>Vendor 2:________________</w:t>
             </w:r>
           </w:p>
         </w:tc>
         <w:tc>
           <w:tcPr>
-            <w:tcW w:w="1872" w:type="dxa"/>
+            <w:tcW w:w="1728" w:type="dxa"/>
           </w:tcPr>
           <w:p>
-            <w:pPr>
-              <w:cnfStyle w:val="100000000000" w:firstRow="1" w:lastRow="0" w:firstColumn="0" w:lastColumn="0" w:oddVBand="0" w:evenVBand="0" w:oddHBand="0" w:evenHBand="0" w:firstRowFirstColumn="0" w:firstRowLastColumn="0" w:lastRowFirstColumn="0" w:lastRowLastColumn="0"/>
-            </w:pPr>
             <w:r>
-              <w:t>Vendor 3:</w:t>
-            </w:r>
-            <w:r>
-              <w:br/>
-              <w:t>________________</w:t>
+              <w:t>Vendor 3:________________</w:t>
             </w:r>
           </w:p>
         </w:tc>
         <w:tc>
           <w:tcPr>
-            <w:tcW w:w="1872" w:type="dxa"/>
+            <w:tcW w:w="1728" w:type="dxa"/>
           </w:tcPr>
           <w:p>
-            <w:pPr>
-              <w:cnfStyle w:val="100000000000" w:firstRow="1" w:lastRow="0" w:firstColumn="0" w:lastColumn="0" w:oddVBand="0" w:evenVBand="0" w:oddHBand="0" w:evenHBand="0" w:firstRowFirstColumn="0" w:firstRowLastColumn="0" w:lastRowFirstColumn="0" w:lastRowLastColumn="0"/>
-            </w:pPr>
             <w:r>
-              <w:t>Vendor 4:</w:t>
-            </w:r>
-            <w:r>
-              <w:br/>
-              <w:t>________________</w:t>
+              <w:t>Vendor 4:________________</w:t>
             </w:r>
           </w:p>
         </w:tc>
       </w:tr>
       <w:tr>
-        <w:trPr>
-          <w:cnfStyle w:val="000000100000" w:firstRow="0" w:lastRow="0" w:firstColumn="0" w:lastColumn="0" w:oddVBand="0" w:evenVBand="0" w:oddHBand="1" w:evenHBand="0" w:firstRowFirstColumn="0" w:firstRowLastColumn="0" w:lastRowFirstColumn="0" w:lastRowLastColumn="0"/>
-        </w:trPr>
         <w:tc>
           <w:tcPr>
-            <w:cnfStyle w:val="001000000000" w:firstRow="0" w:lastRow="0" w:firstColumn="1" w:lastColumn="0" w:oddVBand="0" w:evenVBand="0" w:oddHBand="0" w:evenHBand="0" w:firstRowFirstColumn="0" w:firstRowLastColumn="0" w:lastRowFirstColumn="0" w:lastRowLastColumn="0"/>
-            <w:tcW w:w="2160" w:type="dxa"/>
+            <w:tcW w:w="1728" w:type="dxa"/>
           </w:tcPr>
           <w:p>
             <w:r>
@@ -1311,53 +988,33 @@
         </w:tc>
         <w:tc>
           <w:tcPr>
-            <w:tcW w:w="1872" w:type="dxa"/>
+            <w:tcW w:w="1728" w:type="dxa"/>
           </w:tcPr>
-          <w:p>
-            <w:pPr>
-              <w:cnfStyle w:val="000000100000" w:firstRow="0" w:lastRow="0" w:firstColumn="0" w:lastColumn="0" w:oddVBand="0" w:evenVBand="0" w:oddHBand="1" w:evenHBand="0" w:firstRowFirstColumn="0" w:firstRowLastColumn="0" w:lastRowFirstColumn="0" w:lastRowLastColumn="0"/>
-            </w:pPr>
-          </w:p>
+          <w:p/>
         </w:tc>
         <w:tc>
           <w:tcPr>
-            <w:tcW w:w="1872" w:type="dxa"/>
+            <w:tcW w:w="1728" w:type="dxa"/>
           </w:tcPr>
-          <w:p>
-            <w:pPr>
-              <w:cnfStyle w:val="000000100000" w:firstRow="0" w:lastRow="0" w:firstColumn="0" w:lastColumn="0" w:oddVBand="0" w:evenVBand="0" w:oddHBand="1" w:evenHBand="0" w:firstRowFirstColumn="0" w:firstRowLastColumn="0" w:lastRowFirstColumn="0" w:lastRowLastColumn="0"/>
-            </w:pPr>
-          </w:p>
+          <w:p/>
         </w:tc>
         <w:tc>
           <w:tcPr>
-            <w:tcW w:w="1872" w:type="dxa"/>
+            <w:tcW w:w="1728" w:type="dxa"/>
           </w:tcPr>
-          <w:p>
-            <w:pPr>
-              <w:cnfStyle w:val="000000100000" w:firstRow="0" w:lastRow="0" w:firstColumn="0" w:lastColumn="0" w:oddVBand="0" w:evenVBand="0" w:oddHBand="1" w:evenHBand="0" w:firstRowFirstColumn="0" w:firstRowLastColumn="0" w:lastRowFirstColumn="0" w:lastRowLastColumn="0"/>
-            </w:pPr>
-          </w:p>
+          <w:p/>
         </w:tc>
         <w:tc>
           <w:tcPr>
-            <w:tcW w:w="1872" w:type="dxa"/>
+            <w:tcW w:w="1728" w:type="dxa"/>
           </w:tcPr>
-          <w:p>
-            <w:pPr>
-              <w:cnfStyle w:val="000000100000" w:firstRow="0" w:lastRow="0" w:firstColumn="0" w:lastColumn="0" w:oddVBand="0" w:evenVBand="0" w:oddHBand="1" w:evenHBand="0" w:firstRowFirstColumn="0" w:firstRowLastColumn="0" w:lastRowFirstColumn="0" w:lastRowLastColumn="0"/>
-            </w:pPr>
-          </w:p>
+          <w:p/>
         </w:tc>
       </w:tr>
       <w:tr>
-        <w:trPr>
-          <w:cnfStyle w:val="000000010000" w:firstRow="0" w:lastRow="0" w:firstColumn="0" w:lastColumn="0" w:oddVBand="0" w:evenVBand="0" w:oddHBand="0" w:evenHBand="1" w:firstRowFirstColumn="0" w:firstRowLastColumn="0" w:lastRowFirstColumn="0" w:lastRowLastColumn="0"/>
-        </w:trPr>
         <w:tc>
           <w:tcPr>
-            <w:cnfStyle w:val="001000000000" w:firstRow="0" w:lastRow="0" w:firstColumn="1" w:lastColumn="0" w:oddVBand="0" w:evenVBand="0" w:oddHBand="0" w:evenHBand="0" w:firstRowFirstColumn="0" w:firstRowLastColumn="0" w:lastRowFirstColumn="0" w:lastRowLastColumn="0"/>
-            <w:tcW w:w="2160" w:type="dxa"/>
+            <w:tcW w:w="1728" w:type="dxa"/>
           </w:tcPr>
           <w:p>
             <w:r>
@@ -1367,53 +1024,33 @@
         </w:tc>
         <w:tc>
           <w:tcPr>
-            <w:tcW w:w="1872" w:type="dxa"/>
+            <w:tcW w:w="1728" w:type="dxa"/>
           </w:tcPr>
-          <w:p>
-            <w:pPr>
-              <w:cnfStyle w:val="000000010000" w:firstRow="0" w:lastRow="0" w:firstColumn="0" w:lastColumn="0" w:oddVBand="0" w:evenVBand="0" w:oddHBand="0" w:evenHBand="1" w:firstRowFirstColumn="0" w:firstRowLastColumn="0" w:lastRowFirstColumn="0" w:lastRowLastColumn="0"/>
-            </w:pPr>
-          </w:p>
+          <w:p/>
         </w:tc>
         <w:tc>
           <w:tcPr>
-            <w:tcW w:w="1872" w:type="dxa"/>
+            <w:tcW w:w="1728" w:type="dxa"/>
           </w:tcPr>
-          <w:p>
-            <w:pPr>
-              <w:cnfStyle w:val="000000010000" w:firstRow="0" w:lastRow="0" w:firstColumn="0" w:lastColumn="0" w:oddVBand="0" w:evenVBand="0" w:oddHBand="0" w:evenHBand="1" w:firstRowFirstColumn="0" w:firstRowLastColumn="0" w:lastRowFirstColumn="0" w:lastRowLastColumn="0"/>
-            </w:pPr>
-          </w:p>
+          <w:p/>
         </w:tc>
         <w:tc>
           <w:tcPr>
-            <w:tcW w:w="1872" w:type="dxa"/>
+            <w:tcW w:w="1728" w:type="dxa"/>
           </w:tcPr>
-          <w:p>
-            <w:pPr>
-              <w:cnfStyle w:val="000000010000" w:firstRow="0" w:lastRow="0" w:firstColumn="0" w:lastColumn="0" w:oddVBand="0" w:evenVBand="0" w:oddHBand="0" w:evenHBand="1" w:firstRowFirstColumn="0" w:firstRowLastColumn="0" w:lastRowFirstColumn="0" w:lastRowLastColumn="0"/>
-            </w:pPr>
-          </w:p>
+          <w:p/>
         </w:tc>
         <w:tc>
           <w:tcPr>
-            <w:tcW w:w="1872" w:type="dxa"/>
+            <w:tcW w:w="1728" w:type="dxa"/>
           </w:tcPr>
-          <w:p>
-            <w:pPr>
-              <w:cnfStyle w:val="000000010000" w:firstRow="0" w:lastRow="0" w:firstColumn="0" w:lastColumn="0" w:oddVBand="0" w:evenVBand="0" w:oddHBand="0" w:evenHBand="1" w:firstRowFirstColumn="0" w:firstRowLastColumn="0" w:lastRowFirstColumn="0" w:lastRowLastColumn="0"/>
-            </w:pPr>
-          </w:p>
+          <w:p/>
         </w:tc>
       </w:tr>
       <w:tr>
-        <w:trPr>
-          <w:cnfStyle w:val="000000100000" w:firstRow="0" w:lastRow="0" w:firstColumn="0" w:lastColumn="0" w:oddVBand="0" w:evenVBand="0" w:oddHBand="1" w:evenHBand="0" w:firstRowFirstColumn="0" w:firstRowLastColumn="0" w:lastRowFirstColumn="0" w:lastRowLastColumn="0"/>
-        </w:trPr>
         <w:tc>
           <w:tcPr>
-            <w:cnfStyle w:val="001000000000" w:firstRow="0" w:lastRow="0" w:firstColumn="1" w:lastColumn="0" w:oddVBand="0" w:evenVBand="0" w:oddHBand="0" w:evenHBand="0" w:firstRowFirstColumn="0" w:firstRowLastColumn="0" w:lastRowFirstColumn="0" w:lastRowLastColumn="0"/>
-            <w:tcW w:w="2160" w:type="dxa"/>
+            <w:tcW w:w="1728" w:type="dxa"/>
           </w:tcPr>
           <w:p>
             <w:r>
@@ -1423,53 +1060,33 @@
         </w:tc>
         <w:tc>
           <w:tcPr>
-            <w:tcW w:w="1872" w:type="dxa"/>
+            <w:tcW w:w="1728" w:type="dxa"/>
           </w:tcPr>
-          <w:p>
-            <w:pPr>
-              <w:cnfStyle w:val="000000100000" w:firstRow="0" w:lastRow="0" w:firstColumn="0" w:lastColumn="0" w:oddVBand="0" w:evenVBand="0" w:oddHBand="1" w:evenHBand="0" w:firstRowFirstColumn="0" w:firstRowLastColumn="0" w:lastRowFirstColumn="0" w:lastRowLastColumn="0"/>
-            </w:pPr>
-          </w:p>
+          <w:p/>
         </w:tc>
         <w:tc>
           <w:tcPr>
-            <w:tcW w:w="1872" w:type="dxa"/>
+            <w:tcW w:w="1728" w:type="dxa"/>
           </w:tcPr>
-          <w:p>
-            <w:pPr>
-              <w:cnfStyle w:val="000000100000" w:firstRow="0" w:lastRow="0" w:firstColumn="0" w:lastColumn="0" w:oddVBand="0" w:evenVBand="0" w:oddHBand="1" w:evenHBand="0" w:firstRowFirstColumn="0" w:firstRowLastColumn="0" w:lastRowFirstColumn="0" w:lastRowLastColumn="0"/>
-            </w:pPr>
-          </w:p>
+          <w:p/>
         </w:tc>
         <w:tc>
           <w:tcPr>
-            <w:tcW w:w="1872" w:type="dxa"/>
+            <w:tcW w:w="1728" w:type="dxa"/>
           </w:tcPr>
-          <w:p>
-            <w:pPr>
-              <w:cnfStyle w:val="000000100000" w:firstRow="0" w:lastRow="0" w:firstColumn="0" w:lastColumn="0" w:oddVBand="0" w:evenVBand="0" w:oddHBand="1" w:evenHBand="0" w:firstRowFirstColumn="0" w:firstRowLastColumn="0" w:lastRowFirstColumn="0" w:lastRowLastColumn="0"/>
-            </w:pPr>
-          </w:p>
+          <w:p/>
         </w:tc>
         <w:tc>
           <w:tcPr>
-            <w:tcW w:w="1872" w:type="dxa"/>
+            <w:tcW w:w="1728" w:type="dxa"/>
           </w:tcPr>
-          <w:p>
-            <w:pPr>
-              <w:cnfStyle w:val="000000100000" w:firstRow="0" w:lastRow="0" w:firstColumn="0" w:lastColumn="0" w:oddVBand="0" w:evenVBand="0" w:oddHBand="1" w:evenHBand="0" w:firstRowFirstColumn="0" w:firstRowLastColumn="0" w:lastRowFirstColumn="0" w:lastRowLastColumn="0"/>
-            </w:pPr>
-          </w:p>
+          <w:p/>
         </w:tc>
       </w:tr>
       <w:tr>
-        <w:trPr>
-          <w:cnfStyle w:val="000000010000" w:firstRow="0" w:lastRow="0" w:firstColumn="0" w:lastColumn="0" w:oddVBand="0" w:evenVBand="0" w:oddHBand="0" w:evenHBand="1" w:firstRowFirstColumn="0" w:firstRowLastColumn="0" w:lastRowFirstColumn="0" w:lastRowLastColumn="0"/>
-        </w:trPr>
         <w:tc>
           <w:tcPr>
-            <w:cnfStyle w:val="001000000000" w:firstRow="0" w:lastRow="0" w:firstColumn="1" w:lastColumn="0" w:oddVBand="0" w:evenVBand="0" w:oddHBand="0" w:evenHBand="0" w:firstRowFirstColumn="0" w:firstRowLastColumn="0" w:lastRowFirstColumn="0" w:lastRowLastColumn="0"/>
-            <w:tcW w:w="2160" w:type="dxa"/>
+            <w:tcW w:w="1728" w:type="dxa"/>
           </w:tcPr>
           <w:p>
             <w:r>
@@ -1479,53 +1096,33 @@
         </w:tc>
         <w:tc>
           <w:tcPr>
-            <w:tcW w:w="1872" w:type="dxa"/>
+            <w:tcW w:w="1728" w:type="dxa"/>
           </w:tcPr>
-          <w:p>
-            <w:pPr>
-              <w:cnfStyle w:val="000000010000" w:firstRow="0" w:lastRow="0" w:firstColumn="0" w:lastColumn="0" w:oddVBand="0" w:evenVBand="0" w:oddHBand="0" w:evenHBand="1" w:firstRowFirstColumn="0" w:firstRowLastColumn="0" w:lastRowFirstColumn="0" w:lastRowLastColumn="0"/>
-            </w:pPr>
-          </w:p>
+          <w:p/>
         </w:tc>
         <w:tc>
           <w:tcPr>
-            <w:tcW w:w="1872" w:type="dxa"/>
+            <w:tcW w:w="1728" w:type="dxa"/>
           </w:tcPr>
-          <w:p>
-            <w:pPr>
-              <w:cnfStyle w:val="000000010000" w:firstRow="0" w:lastRow="0" w:firstColumn="0" w:lastColumn="0" w:oddVBand="0" w:evenVBand="0" w:oddHBand="0" w:evenHBand="1" w:firstRowFirstColumn="0" w:firstRowLastColumn="0" w:lastRowFirstColumn="0" w:lastRowLastColumn="0"/>
-            </w:pPr>
-          </w:p>
+          <w:p/>
         </w:tc>
         <w:tc>
           <w:tcPr>
-            <w:tcW w:w="1872" w:type="dxa"/>
+            <w:tcW w:w="1728" w:type="dxa"/>
           </w:tcPr>
-          <w:p>
-            <w:pPr>
-              <w:cnfStyle w:val="000000010000" w:firstRow="0" w:lastRow="0" w:firstColumn="0" w:lastColumn="0" w:oddVBand="0" w:evenVBand="0" w:oddHBand="0" w:evenHBand="1" w:firstRowFirstColumn="0" w:firstRowLastColumn="0" w:lastRowFirstColumn="0" w:lastRowLastColumn="0"/>
-            </w:pPr>
-          </w:p>
+          <w:p/>
         </w:tc>
         <w:tc>
           <w:tcPr>
-            <w:tcW w:w="1872" w:type="dxa"/>
+            <w:tcW w:w="1728" w:type="dxa"/>
           </w:tcPr>
-          <w:p>
-            <w:pPr>
-              <w:cnfStyle w:val="000000010000" w:firstRow="0" w:lastRow="0" w:firstColumn="0" w:lastColumn="0" w:oddVBand="0" w:evenVBand="0" w:oddHBand="0" w:evenHBand="1" w:firstRowFirstColumn="0" w:firstRowLastColumn="0" w:lastRowFirstColumn="0" w:lastRowLastColumn="0"/>
-            </w:pPr>
-          </w:p>
+          <w:p/>
         </w:tc>
       </w:tr>
       <w:tr>
-        <w:trPr>
-          <w:cnfStyle w:val="000000100000" w:firstRow="0" w:lastRow="0" w:firstColumn="0" w:lastColumn="0" w:oddVBand="0" w:evenVBand="0" w:oddHBand="1" w:evenHBand="0" w:firstRowFirstColumn="0" w:firstRowLastColumn="0" w:lastRowFirstColumn="0" w:lastRowLastColumn="0"/>
-        </w:trPr>
         <w:tc>
           <w:tcPr>
-            <w:cnfStyle w:val="001000000000" w:firstRow="0" w:lastRow="0" w:firstColumn="1" w:lastColumn="0" w:oddVBand="0" w:evenVBand="0" w:oddHBand="0" w:evenHBand="0" w:firstRowFirstColumn="0" w:firstRowLastColumn="0" w:lastRowFirstColumn="0" w:lastRowLastColumn="0"/>
-            <w:tcW w:w="2160" w:type="dxa"/>
+            <w:tcW w:w="1728" w:type="dxa"/>
           </w:tcPr>
           <w:p>
             <w:r>
@@ -1535,73 +1132,69 @@
         </w:tc>
         <w:tc>
           <w:tcPr>
-            <w:tcW w:w="1872" w:type="dxa"/>
+            <w:tcW w:w="1728" w:type="dxa"/>
           </w:tcPr>
-          <w:p>
-            <w:pPr>
-              <w:cnfStyle w:val="000000100000" w:firstRow="0" w:lastRow="0" w:firstColumn="0" w:lastColumn="0" w:oddVBand="0" w:evenVBand="0" w:oddHBand="1" w:evenHBand="0" w:firstRowFirstColumn="0" w:firstRowLastColumn="0" w:lastRowFirstColumn="0" w:lastRowLastColumn="0"/>
-            </w:pPr>
-          </w:p>
+          <w:p/>
         </w:tc>
         <w:tc>
           <w:tcPr>
-            <w:tcW w:w="1872" w:type="dxa"/>
+            <w:tcW w:w="1728" w:type="dxa"/>
           </w:tcPr>
-          <w:p>
-            <w:pPr>
-              <w:cnfStyle w:val="000000100000" w:firstRow="0" w:lastRow="0" w:firstColumn="0" w:lastColumn="0" w:oddVBand="0" w:evenVBand="0" w:oddHBand="1" w:evenHBand="0" w:firstRowFirstColumn="0" w:firstRowLastColumn="0" w:lastRowFirstColumn="0" w:lastRowLastColumn="0"/>
-            </w:pPr>
-          </w:p>
+          <w:p/>
         </w:tc>
         <w:tc>
           <w:tcPr>
-            <w:tcW w:w="1872" w:type="dxa"/>
+            <w:tcW w:w="1728" w:type="dxa"/>
           </w:tcPr>
-          <w:p>
-            <w:pPr>
-              <w:cnfStyle w:val="000000100000" w:firstRow="0" w:lastRow="0" w:firstColumn="0" w:lastColumn="0" w:oddVBand="0" w:evenVBand="0" w:oddHBand="1" w:evenHBand="0" w:firstRowFirstColumn="0" w:firstRowLastColumn="0" w:lastRowFirstColumn="0" w:lastRowLastColumn="0"/>
-            </w:pPr>
-          </w:p>
+          <w:p/>
         </w:tc>
         <w:tc>
           <w:tcPr>
-            <w:tcW w:w="1872" w:type="dxa"/>
+            <w:tcW w:w="1728" w:type="dxa"/>
           </w:tcPr>
-          <w:p>
-            <w:pPr>
-              <w:cnfStyle w:val="000000100000" w:firstRow="0" w:lastRow="0" w:firstColumn="0" w:lastColumn="0" w:oddVBand="0" w:evenVBand="0" w:oddHBand="1" w:evenHBand="0" w:firstRowFirstColumn="0" w:firstRowLastColumn="0" w:lastRowFirstColumn="0" w:lastRowLastColumn="0"/>
-            </w:pPr>
-          </w:p>
+          <w:p/>
         </w:tc>
       </w:tr>
     </w:tbl>
+    <w:p/>
     <w:p>
       <w:r>
-        <w:br/>
-      </w:r>
-      <w:r>
-        <w:br/>
-      </w:r>
-    </w:p>
-    <w:p>
-      <w:r>
-        <w:rPr>
-          <w:b/>
-        </w:rPr>
         <w:t>Final Recommendation / Selected Vendor: _____________________________________</w:t>
       </w:r>
     </w:p>
     <w:p>
       <w:r>
-        <w:br/>
+        <w:t>Stakeholder Sign-off: ___________________________   Date: ______________</w:t>
       </w:r>
+    </w:p>
+    <w:p/>
+    <w:p/>
+    <w:p/>
+    <w:p>
+      <w:r>
+        <w:rPr>
+          <w:color w:val="64748B"/>
+          <w:sz w:val="20"/>
+        </w:rPr>
+        <w:t xml:space="preserve">For independent, verified software comparisons, visit </w:t>
+      </w:r>
+      <w:hyperlink r:id="rId7" w:history="1">
+        <w:r>
+          <w:rPr>
+            <w:rStyle w:val="Hyperlink"/>
+            <w:sz w:val="20"/>
+          </w:rPr>
+          <w:t>TheHRStackGuide.com</w:t>
+        </w:r>
+      </w:hyperlink>
     </w:p>
     <w:p>
       <w:r>
         <w:rPr>
-          <w:b/>
+          <w:color w:val="64748B"/>
+          <w:sz w:val="20"/>
         </w:rPr>
-        <w:t>Stakeholder Sign-off: ___________________________   Date: ______________</w:t>
+        <w:t>Use our free Cost Calculators and Vendor Trade-offs to prepare for your next demo.</w:t>
       </w:r>
     </w:p>
     <w:sectPr>
@@ -1787,31 +1380,31 @@
       </w:rPr>
     </w:lvl>
   </w:abstractNum>
-  <w:num w:numId="1" w16cid:durableId="1331521840">
+  <w:num w:numId="1" w16cid:durableId="216279199">
     <w:abstractNumId w:val="8"/>
   </w:num>
-  <w:num w:numId="2" w16cid:durableId="498228654">
+  <w:num w:numId="2" w16cid:durableId="866942099">
     <w:abstractNumId w:val="6"/>
   </w:num>
-  <w:num w:numId="3" w16cid:durableId="1603875526">
+  <w:num w:numId="3" w16cid:durableId="967709169">
     <w:abstractNumId w:val="5"/>
   </w:num>
-  <w:num w:numId="4" w16cid:durableId="1848055918">
+  <w:num w:numId="4" w16cid:durableId="489440541">
     <w:abstractNumId w:val="4"/>
   </w:num>
-  <w:num w:numId="5" w16cid:durableId="1151598874">
+  <w:num w:numId="5" w16cid:durableId="175968660">
     <w:abstractNumId w:val="7"/>
   </w:num>
-  <w:num w:numId="6" w16cid:durableId="1715151147">
+  <w:num w:numId="6" w16cid:durableId="1397968256">
     <w:abstractNumId w:val="3"/>
   </w:num>
-  <w:num w:numId="7" w16cid:durableId="566721931">
+  <w:num w:numId="7" w16cid:durableId="1290745390">
     <w:abstractNumId w:val="2"/>
   </w:num>
-  <w:num w:numId="8" w16cid:durableId="1947421730">
+  <w:num w:numId="8" w16cid:durableId="2041513786">
     <w:abstractNumId w:val="1"/>
   </w:num>
-  <w:num w:numId="9" w16cid:durableId="1988702144">
+  <w:num w:numId="9" w16cid:durableId="378362741">
     <w:abstractNumId w:val="0"/>
   </w:num>
 </w:numbering>
@@ -2207,9 +1800,6 @@
     <w:name w:val="Normal"/>
     <w:qFormat/>
     <w:rsid w:val="00FC693F"/>
-    <w:rPr>
-      <w:rFonts w:ascii="Helvetica" w:hAnsi="Helvetica"/>
-    </w:rPr>
   </w:style>
   <w:style w:type="paragraph" w:styleId="Heading1">
     <w:name w:val="heading 1"/>
@@ -13199,6 +12789,29 @@
         <w:shd w:val="clear" w:color="auto" w:fill="FBCAA2" w:themeFill="accent6" w:themeFillTint="7F"/>
       </w:tcPr>
     </w:tblStylePr>
+  </w:style>
+  <w:style w:type="character" w:styleId="Hyperlink">
+    <w:name w:val="Hyperlink"/>
+    <w:basedOn w:val="DefaultParagraphFont"/>
+    <w:uiPriority w:val="99"/>
+    <w:unhideWhenUsed/>
+    <w:rsid w:val="00330FF9"/>
+    <w:rPr>
+      <w:color w:val="0000FF" w:themeColor="hyperlink"/>
+      <w:u w:val="single"/>
+    </w:rPr>
+  </w:style>
+  <w:style w:type="character" w:styleId="UnresolvedMention">
+    <w:name w:val="Unresolved Mention"/>
+    <w:basedOn w:val="DefaultParagraphFont"/>
+    <w:uiPriority w:val="99"/>
+    <w:semiHidden/>
+    <w:unhideWhenUsed/>
+    <w:rsid w:val="00330FF9"/>
+    <w:rPr>
+      <w:color w:val="605E5C"/>
+      <w:shd w:val="clear" w:color="auto" w:fill="E1DFDD"/>
+    </w:rPr>
   </w:style>
 </w:styles>
 </file>

</xml_diff>